<commit_message>
Complete CareOrbit billing imports recovery and client UAT
</commit_message>
<xml_diff>
--- a/docs/CareOrbit_Client_Training_and_UAT_Manual.docx
+++ b/docs/CareOrbit_Client_Training_and_UAT_Manual.docx
@@ -597,6 +597,45 @@
             </w:r>
             <w:r>
               <w:t>In-app notifications are active. External WhatsApp/SMS delivery is not included unless a messaging provider is configured separately.</w:t>
+            </w:r>
+          </w:p>
+        </w:tc>
+      </w:tr>
+    </w:tbl>
+    <w:p>
+      <w:pPr>
+        <w:spacing w:after="0"/>
+      </w:pPr>
+    </w:p>
+    <w:tbl>
+      <w:tblPr>
+        <w:tblStyle w:val="TableGrid"/>
+        <w:tblW w:type="auto" w:w="0"/>
+        <w:tblLook w:firstColumn="1" w:firstRow="1" w:lastColumn="0" w:lastRow="0" w:noHBand="0" w:noVBand="1" w:val="04A0"/>
+      </w:tblPr>
+      <w:tblGrid>
+        <w:gridCol w:w="10166"/>
+      </w:tblGrid>
+      <w:tr>
+        <w:tc>
+          <w:tcPr>
+            <w:tcW w:type="dxa" w:w="10166"/>
+            <w:shd w:fill="E8F5F3"/>
+          </w:tcPr>
+          <w:p>
+            <w:pPr>
+              <w:spacing w:after="0"/>
+            </w:pPr>
+            <w:r/>
+            <w:r>
+              <w:rPr>
+                <w:b/>
+                <w:color w:val="0F766E"/>
+              </w:rPr>
+              <w:t xml:space="preserve">Acceptance status  </w:t>
+            </w:r>
+            <w:r>
+              <w:t>Development verification confirms technical behavior. Client UAT remains pending until the client completes the test cases and signs the acceptance section.</w:t>
             </w:r>
           </w:p>
         </w:tc>
@@ -1296,6 +1335,99 @@
       <w:r>
         <w:t>Always use the profile menu and Sign out when leaving a shared computer. Closing the tab alone is not a secure sign-out.</w:t>
       </w:r>
+    </w:p>
+    <w:p>
+      <w:pPr>
+        <w:pStyle w:val="Heading2"/>
+        <w:keepNext/>
+      </w:pPr>
+      <w:r>
+        <w:t>Forgotten password</w:t>
+      </w:r>
+    </w:p>
+    <w:p>
+      <w:pPr>
+        <w:pStyle w:val="ListNumber"/>
+        <w:spacing w:after="60"/>
+      </w:pPr>
+      <w:r>
+        <w:t>On the sign-in page, select Forgot password?.</w:t>
+      </w:r>
+    </w:p>
+    <w:p>
+      <w:pPr>
+        <w:pStyle w:val="ListNumber"/>
+        <w:spacing w:after="60"/>
+      </w:pPr>
+      <w:r>
+        <w:t>Enter the account email and select Send reset link.</w:t>
+      </w:r>
+    </w:p>
+    <w:p>
+      <w:pPr>
+        <w:pStyle w:val="ListNumber"/>
+        <w:spacing w:after="60"/>
+      </w:pPr>
+      <w:r>
+        <w:t>Open the CareOrbit recovery email and select the secure link.</w:t>
+      </w:r>
+    </w:p>
+    <w:p>
+      <w:pPr>
+        <w:pStyle w:val="ListNumber"/>
+        <w:spacing w:after="60"/>
+      </w:pPr>
+      <w:r>
+        <w:t>Enter and confirm a password that satisfies every displayed requirement.</w:t>
+      </w:r>
+    </w:p>
+    <w:p>
+      <w:pPr>
+        <w:pStyle w:val="ListNumber"/>
+        <w:spacing w:after="60"/>
+      </w:pPr>
+      <w:r>
+        <w:t>Select Update password, then sign in again using the new password.</w:t>
+      </w:r>
+    </w:p>
+    <w:tbl>
+      <w:tblPr>
+        <w:tblStyle w:val="TableGrid"/>
+        <w:tblW w:type="auto" w:w="0"/>
+        <w:tblLook w:firstColumn="1" w:firstRow="1" w:lastColumn="0" w:lastRow="0" w:noHBand="0" w:noVBand="1" w:val="04A0"/>
+      </w:tblPr>
+      <w:tblGrid>
+        <w:gridCol w:w="10166"/>
+      </w:tblGrid>
+      <w:tr>
+        <w:tc>
+          <w:tcPr>
+            <w:tcW w:type="dxa" w:w="10166"/>
+            <w:shd w:fill="EAF2F8"/>
+          </w:tcPr>
+          <w:p>
+            <w:pPr>
+              <w:spacing w:after="0"/>
+            </w:pPr>
+            <w:r/>
+            <w:r>
+              <w:rPr>
+                <w:b/>
+                <w:color w:val="0F766E"/>
+              </w:rPr>
+              <w:t xml:space="preserve">Expired link  </w:t>
+            </w:r>
+            <w:r>
+              <w:t>If the recovery page says the link is invalid, expired or already used, request a new link. Never forward recovery emails.</w:t>
+            </w:r>
+          </w:p>
+        </w:tc>
+      </w:tr>
+    </w:tbl>
+    <w:p>
+      <w:pPr>
+        <w:spacing w:after="0"/>
+      </w:pPr>
     </w:p>
     <w:p>
       <w:pPr>
@@ -1988,6 +2120,60 @@
         <w:keepNext/>
       </w:pPr>
       <w:r>
+        <w:t>Configure invoice branding (administrator)</w:t>
+      </w:r>
+    </w:p>
+    <w:p>
+      <w:pPr>
+        <w:pStyle w:val="ListNumber"/>
+        <w:spacing w:after="60"/>
+      </w:pPr>
+      <w:r>
+        <w:t>Open Hospital Settings.</w:t>
+      </w:r>
+    </w:p>
+    <w:p>
+      <w:pPr>
+        <w:pStyle w:val="ListNumber"/>
+        <w:spacing w:after="60"/>
+      </w:pPr>
+      <w:r>
+        <w:t>Enter the hospital identity, legal, contact, address and tax details.</w:t>
+      </w:r>
+    </w:p>
+    <w:p>
+      <w:pPr>
+        <w:pStyle w:val="ListNumber"/>
+        <w:spacing w:after="60"/>
+      </w:pPr>
+      <w:r>
+        <w:t>Upload a PNG, JPG or WebP logo no larger than 2 MB.</w:t>
+      </w:r>
+    </w:p>
+    <w:p>
+      <w:pPr>
+        <w:pStyle w:val="ListNumber"/>
+        <w:spacing w:after="60"/>
+      </w:pPr>
+      <w:r>
+        <w:t>Enter invoice terms, payment details, footer and authorized signatory.</w:t>
+      </w:r>
+    </w:p>
+    <w:p>
+      <w:pPr>
+        <w:pStyle w:val="ListNumber"/>
+        <w:spacing w:after="60"/>
+      </w:pPr>
+      <w:r>
+        <w:t>Save and verify the logo and hospital details appear in invoice preview.</w:t>
+      </w:r>
+    </w:p>
+    <w:p>
+      <w:pPr>
+        <w:pStyle w:val="Heading2"/>
+        <w:keepNext/>
+      </w:pPr>
+      <w:r>
         <w:t>Create an invoice</w:t>
       </w:r>
     </w:p>
@@ -1997,7 +2183,7 @@
         <w:spacing w:after="60"/>
       </w:pPr>
       <w:r>
-        <w:t>Open Billing &amp; Payments and select New invoice.</w:t>
+        <w:t>Open Billing &amp; Payments and select New draft.</w:t>
       </w:r>
     </w:p>
     <w:p>
@@ -2015,7 +2201,7 @@
         <w:spacing w:after="60"/>
       </w:pPr>
       <w:r>
-        <w:t>Add each service or item with quantity and unit price.</w:t>
+        <w:t>Choose catalogue services or add a custom line with quantity, price and tax rate.</w:t>
       </w:r>
     </w:p>
     <w:p>
@@ -2024,7 +2210,7 @@
         <w:spacing w:after="60"/>
       </w:pPr>
       <w:r>
-        <w:t>Enter discount, tax and notes when applicable.</w:t>
+        <w:t>Enter discount and notes when applicable.</w:t>
       </w:r>
     </w:p>
     <w:p>
@@ -2033,7 +2219,33 @@
         <w:spacing w:after="60"/>
       </w:pPr>
       <w:r>
-        <w:t>Confirm the total and create the invoice.</w:t>
+        <w:t>Confirm the calculated subtotal, tax and total, then save the draft.</w:t>
+      </w:r>
+    </w:p>
+    <w:p>
+      <w:pPr>
+        <w:pStyle w:val="ListNumber"/>
+        <w:spacing w:after="60"/>
+      </w:pPr>
+      <w:r>
+        <w:t>Select Preview and compare patient, hospital and financial details.</w:t>
+      </w:r>
+    </w:p>
+    <w:p>
+      <w:pPr>
+        <w:pStyle w:val="ListNumber"/>
+        <w:spacing w:after="60"/>
+      </w:pPr>
+      <w:r>
+        <w:t>Select Finalize invoice only after the preview is correct.</w:t>
+      </w:r>
+    </w:p>
+    <w:p>
+      <w:pPr>
+        <w:spacing w:after="100" w:line="252" w:lineRule="auto"/>
+      </w:pPr>
+      <w:r>
+        <w:t>Drafts may be edited or deleted and do not count as patient debt. Finalized invoice financial lines cannot be edited. An unpaid issued invoice may be cancelled only with a reason; paid invoices require a separate refund process.</w:t>
       </w:r>
     </w:p>
     <w:p>
@@ -2088,6 +2300,15 @@
       </w:pPr>
       <w:r>
         <w:t>Confirm paid amount, balance and invoice status are updated.</w:t>
+      </w:r>
+    </w:p>
+    <w:p>
+      <w:pPr>
+        <w:pStyle w:val="ListNumber"/>
+        <w:spacing w:after="60"/>
+      </w:pPr>
+      <w:r>
+        <w:t>Select the generated receipt number to download the branded payment receipt PDF.</w:t>
       </w:r>
     </w:p>
     <w:p>
@@ -2265,6 +2486,551 @@
       </w:pPr>
     </w:p>
     <w:p>
+      <w:pPr>
+        <w:pStyle w:val="Heading1"/>
+        <w:keepNext/>
+      </w:pPr>
+      <w:r>
+        <w:t>11. Controlled Data Imports</w:t>
+      </w:r>
+    </w:p>
+    <w:p>
+      <w:pPr>
+        <w:spacing w:after="100" w:line="252" w:lineRule="auto"/>
+      </w:pPr>
+      <w:r>
+        <w:t>Open Data Imports. Only panels allowed for the signed-in role are shown. Use the supplied template whenever possible.</w:t>
+      </w:r>
+    </w:p>
+    <w:p>
+      <w:pPr>
+        <w:pStyle w:val="Heading2"/>
+        <w:keepNext/>
+      </w:pPr>
+      <w:r>
+        <w:t>Standard import procedure</w:t>
+      </w:r>
+    </w:p>
+    <w:p>
+      <w:pPr>
+        <w:pStyle w:val="ListNumber"/>
+        <w:spacing w:after="60"/>
+      </w:pPr>
+      <w:r>
+        <w:t>Select Template and enter data without formulas or passwords.</w:t>
+      </w:r>
+    </w:p>
+    <w:p>
+      <w:pPr>
+        <w:pStyle w:val="ListNumber"/>
+        <w:spacing w:after="60"/>
+      </w:pPr>
+      <w:r>
+        <w:t>Choose a CSV or XLSX file no larger than 5 MB and 2,000 rows.</w:t>
+      </w:r>
+    </w:p>
+    <w:p>
+      <w:pPr>
+        <w:pStyle w:val="ListNumber"/>
+        <w:spacing w:after="60"/>
+      </w:pPr>
+      <w:r>
+        <w:t>Map each CareOrbit field to the matching file column.</w:t>
+      </w:r>
+    </w:p>
+    <w:p>
+      <w:pPr>
+        <w:pStyle w:val="ListNumber"/>
+        <w:spacing w:after="60"/>
+      </w:pPr>
+      <w:r>
+        <w:t>Review the five-row preview and correct missing required mappings.</w:t>
+      </w:r>
+    </w:p>
+    <w:p>
+      <w:pPr>
+        <w:pStyle w:val="ListNumber"/>
+        <w:spacing w:after="60"/>
+      </w:pPr>
+      <w:r>
+        <w:t>For pharmacy updates, enable existing-record updates only after confirming SKU and batch matches.</w:t>
+      </w:r>
+    </w:p>
+    <w:p>
+      <w:pPr>
+        <w:pStyle w:val="ListNumber"/>
+        <w:spacing w:after="60"/>
+      </w:pPr>
+      <w:r>
+        <w:t>Select the confirmation checkbox and then Confirm import.</w:t>
+      </w:r>
+    </w:p>
+    <w:p>
+      <w:pPr>
+        <w:pStyle w:val="ListNumber"/>
+        <w:spacing w:after="60"/>
+      </w:pPr>
+      <w:r>
+        <w:t>Review imported and skipped totals; download the error report when rows were rejected.</w:t>
+      </w:r>
+    </w:p>
+    <w:tbl>
+      <w:tblPr>
+        <w:tblStyle w:val="TableGrid"/>
+        <w:tblW w:type="auto" w:w="0"/>
+        <w:jc w:val="center"/>
+        <w:tblLook w:firstColumn="1" w:firstRow="1" w:lastColumn="0" w:lastRow="0" w:noHBand="0" w:noVBand="1" w:val="04A0"/>
+      </w:tblPr>
+      <w:tblGrid>
+        <w:gridCol w:w="3389"/>
+        <w:gridCol w:w="3389"/>
+        <w:gridCol w:w="3389"/>
+      </w:tblGrid>
+      <w:tr>
+        <w:tc>
+          <w:tcPr>
+            <w:tcW w:type="dxa" w:w="1944"/>
+            <w:vAlign w:val="center"/>
+            <w:shd w:fill="0F766E"/>
+          </w:tcPr>
+          <w:p>
+            <w:pPr>
+              <w:spacing w:after="0"/>
+            </w:pPr>
+            <w:r/>
+            <w:r>
+              <w:rPr>
+                <w:rFonts w:ascii="Aptos" w:hAnsi="Aptos"/>
+                <w:b/>
+                <w:color w:val="FFFFFF"/>
+                <w:sz w:val="16"/>
+              </w:rPr>
+              <w:t>Import</w:t>
+            </w:r>
+          </w:p>
+        </w:tc>
+        <w:tc>
+          <w:tcPr>
+            <w:tcW w:type="dxa" w:w="2376"/>
+            <w:vAlign w:val="center"/>
+            <w:shd w:fill="0F766E"/>
+          </w:tcPr>
+          <w:p>
+            <w:pPr>
+              <w:spacing w:after="0"/>
+            </w:pPr>
+            <w:r/>
+            <w:r>
+              <w:rPr>
+                <w:rFonts w:ascii="Aptos" w:hAnsi="Aptos"/>
+                <w:b/>
+                <w:color w:val="FFFFFF"/>
+                <w:sz w:val="16"/>
+              </w:rPr>
+              <w:t>Authorized roles</w:t>
+            </w:r>
+          </w:p>
+        </w:tc>
+        <w:tc>
+          <w:tcPr>
+            <w:tcW w:type="dxa" w:w="5400"/>
+            <w:vAlign w:val="center"/>
+            <w:shd w:fill="0F766E"/>
+          </w:tcPr>
+          <w:p>
+            <w:pPr>
+              <w:spacing w:after="0"/>
+            </w:pPr>
+            <w:r/>
+            <w:r>
+              <w:rPr>
+                <w:rFonts w:ascii="Aptos" w:hAnsi="Aptos"/>
+                <w:b/>
+                <w:color w:val="FFFFFF"/>
+                <w:sz w:val="16"/>
+              </w:rPr>
+              <w:t>Key validation</w:t>
+            </w:r>
+          </w:p>
+        </w:tc>
+      </w:tr>
+      <w:tr>
+        <w:tc>
+          <w:tcPr>
+            <w:tcW w:type="dxa" w:w="1944"/>
+            <w:vAlign w:val="center"/>
+          </w:tcPr>
+          <w:p>
+            <w:pPr>
+              <w:spacing w:after="0"/>
+            </w:pPr>
+            <w:r/>
+            <w:r>
+              <w:rPr>
+                <w:rFonts w:ascii="Aptos" w:hAnsi="Aptos"/>
+                <w:b w:val="0"/>
+                <w:color w:val="17324D"/>
+                <w:sz w:val="16"/>
+              </w:rPr>
+              <w:t>Patients</w:t>
+            </w:r>
+          </w:p>
+        </w:tc>
+        <w:tc>
+          <w:tcPr>
+            <w:tcW w:type="dxa" w:w="2376"/>
+            <w:vAlign w:val="center"/>
+          </w:tcPr>
+          <w:p>
+            <w:pPr>
+              <w:spacing w:after="0"/>
+            </w:pPr>
+            <w:r/>
+            <w:r>
+              <w:rPr>
+                <w:rFonts w:ascii="Aptos" w:hAnsi="Aptos"/>
+                <w:b w:val="0"/>
+                <w:color w:val="17324D"/>
+                <w:sz w:val="16"/>
+              </w:rPr>
+              <w:t>Admin, Staff, Nurse</w:t>
+            </w:r>
+          </w:p>
+        </w:tc>
+        <w:tc>
+          <w:tcPr>
+            <w:tcW w:type="dxa" w:w="5400"/>
+            <w:vAlign w:val="center"/>
+          </w:tcPr>
+          <w:p>
+            <w:pPr>
+              <w:spacing w:after="0"/>
+            </w:pPr>
+            <w:r/>
+            <w:r>
+              <w:rPr>
+                <w:rFonts w:ascii="Aptos" w:hAnsi="Aptos"/>
+                <w:b w:val="0"/>
+                <w:color w:val="17324D"/>
+                <w:sz w:val="16"/>
+              </w:rPr>
+              <w:t>MRN, phone, email and name/date-of-birth duplicates</w:t>
+            </w:r>
+          </w:p>
+        </w:tc>
+      </w:tr>
+      <w:tr>
+        <w:tc>
+          <w:tcPr>
+            <w:tcW w:type="dxa" w:w="1944"/>
+            <w:vAlign w:val="center"/>
+            <w:shd w:fill="F3F5F7"/>
+          </w:tcPr>
+          <w:p>
+            <w:pPr>
+              <w:spacing w:after="0"/>
+            </w:pPr>
+            <w:r/>
+            <w:r>
+              <w:rPr>
+                <w:rFonts w:ascii="Aptos" w:hAnsi="Aptos"/>
+                <w:b w:val="0"/>
+                <w:color w:val="17324D"/>
+                <w:sz w:val="16"/>
+              </w:rPr>
+              <w:t>Pharmacy</w:t>
+            </w:r>
+          </w:p>
+        </w:tc>
+        <w:tc>
+          <w:tcPr>
+            <w:tcW w:type="dxa" w:w="2376"/>
+            <w:vAlign w:val="center"/>
+            <w:shd w:fill="F3F5F7"/>
+          </w:tcPr>
+          <w:p>
+            <w:pPr>
+              <w:spacing w:after="0"/>
+            </w:pPr>
+            <w:r/>
+            <w:r>
+              <w:rPr>
+                <w:rFonts w:ascii="Aptos" w:hAnsi="Aptos"/>
+                <w:b w:val="0"/>
+                <w:color w:val="17324D"/>
+                <w:sz w:val="16"/>
+              </w:rPr>
+              <w:t>Admin, Pharmacist</w:t>
+            </w:r>
+          </w:p>
+        </w:tc>
+        <w:tc>
+          <w:tcPr>
+            <w:tcW w:type="dxa" w:w="5400"/>
+            <w:vAlign w:val="center"/>
+            <w:shd w:fill="F3F5F7"/>
+          </w:tcPr>
+          <w:p>
+            <w:pPr>
+              <w:spacing w:after="0"/>
+            </w:pPr>
+            <w:r/>
+            <w:r>
+              <w:rPr>
+                <w:rFonts w:ascii="Aptos" w:hAnsi="Aptos"/>
+                <w:b w:val="0"/>
+                <w:color w:val="17324D"/>
+                <w:sz w:val="16"/>
+              </w:rPr>
+              <w:t>SKU/batch, expiry, quantity and price</w:t>
+            </w:r>
+          </w:p>
+        </w:tc>
+      </w:tr>
+      <w:tr>
+        <w:tc>
+          <w:tcPr>
+            <w:tcW w:type="dxa" w:w="1944"/>
+            <w:vAlign w:val="center"/>
+          </w:tcPr>
+          <w:p>
+            <w:pPr>
+              <w:spacing w:after="0"/>
+            </w:pPr>
+            <w:r/>
+            <w:r>
+              <w:rPr>
+                <w:rFonts w:ascii="Aptos" w:hAnsi="Aptos"/>
+                <w:b w:val="0"/>
+                <w:color w:val="17324D"/>
+                <w:sz w:val="16"/>
+              </w:rPr>
+              <w:t>Billing services</w:t>
+            </w:r>
+          </w:p>
+        </w:tc>
+        <w:tc>
+          <w:tcPr>
+            <w:tcW w:type="dxa" w:w="2376"/>
+            <w:vAlign w:val="center"/>
+          </w:tcPr>
+          <w:p>
+            <w:pPr>
+              <w:spacing w:after="0"/>
+            </w:pPr>
+            <w:r/>
+            <w:r>
+              <w:rPr>
+                <w:rFonts w:ascii="Aptos" w:hAnsi="Aptos"/>
+                <w:b w:val="0"/>
+                <w:color w:val="17324D"/>
+                <w:sz w:val="16"/>
+              </w:rPr>
+              <w:t>Admin, Billing Operator</w:t>
+            </w:r>
+          </w:p>
+        </w:tc>
+        <w:tc>
+          <w:tcPr>
+            <w:tcW w:type="dxa" w:w="5400"/>
+            <w:vAlign w:val="center"/>
+          </w:tcPr>
+          <w:p>
+            <w:pPr>
+              <w:spacing w:after="0"/>
+            </w:pPr>
+            <w:r/>
+            <w:r>
+              <w:rPr>
+                <w:rFonts w:ascii="Aptos" w:hAnsi="Aptos"/>
+                <w:b w:val="0"/>
+                <w:color w:val="17324D"/>
+                <w:sz w:val="16"/>
+              </w:rPr>
+              <w:t>Unique code, price, tax and active status</w:t>
+            </w:r>
+          </w:p>
+        </w:tc>
+      </w:tr>
+      <w:tr>
+        <w:tc>
+          <w:tcPr>
+            <w:tcW w:type="dxa" w:w="1944"/>
+            <w:vAlign w:val="center"/>
+            <w:shd w:fill="F3F5F7"/>
+          </w:tcPr>
+          <w:p>
+            <w:pPr>
+              <w:spacing w:after="0"/>
+            </w:pPr>
+            <w:r/>
+            <w:r>
+              <w:rPr>
+                <w:rFonts w:ascii="Aptos" w:hAnsi="Aptos"/>
+                <w:b w:val="0"/>
+                <w:color w:val="17324D"/>
+                <w:sz w:val="16"/>
+              </w:rPr>
+              <w:t>Appointments</w:t>
+            </w:r>
+          </w:p>
+        </w:tc>
+        <w:tc>
+          <w:tcPr>
+            <w:tcW w:type="dxa" w:w="2376"/>
+            <w:vAlign w:val="center"/>
+            <w:shd w:fill="F3F5F7"/>
+          </w:tcPr>
+          <w:p>
+            <w:pPr>
+              <w:spacing w:after="0"/>
+            </w:pPr>
+            <w:r/>
+            <w:r>
+              <w:rPr>
+                <w:rFonts w:ascii="Aptos" w:hAnsi="Aptos"/>
+                <w:b w:val="0"/>
+                <w:color w:val="17324D"/>
+                <w:sz w:val="16"/>
+              </w:rPr>
+              <w:t>Admin, Staff, Nurse</w:t>
+            </w:r>
+          </w:p>
+        </w:tc>
+        <w:tc>
+          <w:tcPr>
+            <w:tcW w:type="dxa" w:w="5400"/>
+            <w:vAlign w:val="center"/>
+            <w:shd w:fill="F3F5F7"/>
+          </w:tcPr>
+          <w:p>
+            <w:pPr>
+              <w:spacing w:after="0"/>
+            </w:pPr>
+            <w:r/>
+            <w:r>
+              <w:rPr>
+                <w:rFonts w:ascii="Aptos" w:hAnsi="Aptos"/>
+                <w:b w:val="0"/>
+                <w:color w:val="17324D"/>
+                <w:sz w:val="16"/>
+              </w:rPr>
+              <w:t>Existing MRN/doctor, date/time and doctor conflict</w:t>
+            </w:r>
+          </w:p>
+        </w:tc>
+      </w:tr>
+      <w:tr>
+        <w:tc>
+          <w:tcPr>
+            <w:tcW w:type="dxa" w:w="1944"/>
+            <w:vAlign w:val="center"/>
+          </w:tcPr>
+          <w:p>
+            <w:pPr>
+              <w:spacing w:after="0"/>
+            </w:pPr>
+            <w:r/>
+            <w:r>
+              <w:rPr>
+                <w:rFonts w:ascii="Aptos" w:hAnsi="Aptos"/>
+                <w:b w:val="0"/>
+                <w:color w:val="17324D"/>
+                <w:sz w:val="16"/>
+              </w:rPr>
+              <w:t>Staff invitations</w:t>
+            </w:r>
+          </w:p>
+        </w:tc>
+        <w:tc>
+          <w:tcPr>
+            <w:tcW w:type="dxa" w:w="2376"/>
+            <w:vAlign w:val="center"/>
+          </w:tcPr>
+          <w:p>
+            <w:pPr>
+              <w:spacing w:after="0"/>
+            </w:pPr>
+            <w:r/>
+            <w:r>
+              <w:rPr>
+                <w:rFonts w:ascii="Aptos" w:hAnsi="Aptos"/>
+                <w:b w:val="0"/>
+                <w:color w:val="17324D"/>
+                <w:sz w:val="16"/>
+              </w:rPr>
+              <w:t>Admin</w:t>
+            </w:r>
+          </w:p>
+        </w:tc>
+        <w:tc>
+          <w:tcPr>
+            <w:tcW w:type="dxa" w:w="5400"/>
+            <w:vAlign w:val="center"/>
+          </w:tcPr>
+          <w:p>
+            <w:pPr>
+              <w:spacing w:after="0"/>
+            </w:pPr>
+            <w:r/>
+            <w:r>
+              <w:rPr>
+                <w:rFonts w:ascii="Aptos" w:hAnsi="Aptos"/>
+                <w:b w:val="0"/>
+                <w:color w:val="17324D"/>
+                <w:sz w:val="16"/>
+              </w:rPr>
+              <w:t>Email, supported role and secure activation email; no passwords</w:t>
+            </w:r>
+          </w:p>
+        </w:tc>
+      </w:tr>
+    </w:tbl>
+    <w:p>
+      <w:pPr>
+        <w:spacing w:after="0"/>
+      </w:pPr>
+    </w:p>
+    <w:tbl>
+      <w:tblPr>
+        <w:tblStyle w:val="TableGrid"/>
+        <w:tblW w:type="auto" w:w="0"/>
+        <w:tblLook w:firstColumn="1" w:firstRow="1" w:lastColumn="0" w:lastRow="0" w:noHBand="0" w:noVBand="1" w:val="04A0"/>
+      </w:tblPr>
+      <w:tblGrid>
+        <w:gridCol w:w="10166"/>
+      </w:tblGrid>
+      <w:tr>
+        <w:tc>
+          <w:tcPr>
+            <w:tcW w:type="dxa" w:w="10166"/>
+            <w:shd w:fill="EAF2F8"/>
+          </w:tcPr>
+          <w:p>
+            <w:pPr>
+              <w:spacing w:after="0"/>
+            </w:pPr>
+            <w:r/>
+            <w:r>
+              <w:rPr>
+                <w:b/>
+                <w:color w:val="0F766E"/>
+              </w:rPr>
+              <w:t xml:space="preserve">Import safety  </w:t>
+            </w:r>
+            <w:r>
+              <w:t>A skipped row is not silently corrected. Review its error, correct the source file and import that row again.</w:t>
+            </w:r>
+          </w:p>
+        </w:tc>
+      </w:tr>
+    </w:tbl>
+    <w:p>
+      <w:pPr>
+        <w:spacing w:after="0"/>
+      </w:pPr>
+    </w:p>
+    <w:p>
       <w:r>
         <w:br w:type="page"/>
       </w:r>
@@ -2275,7 +3041,7 @@
         <w:keepNext/>
       </w:pPr>
       <w:r>
-        <w:t>11. User Acceptance Testing</w:t>
+        <w:t>12. User Acceptance Testing</w:t>
       </w:r>
     </w:p>
     <w:p>
@@ -3647,7 +4413,7 @@
                 <w:color w:val="17324D"/>
                 <w:sz w:val="15"/>
               </w:rPr>
-              <w:t>UAT-11</w:t>
+              <w:t>UAT-31</w:t>
             </w:r>
           </w:p>
         </w:tc>
@@ -3668,7 +4434,7 @@
                 <w:color w:val="17324D"/>
                 <w:sz w:val="15"/>
               </w:rPr>
-              <w:t>Doctor</w:t>
+              <w:t>All</w:t>
             </w:r>
           </w:p>
         </w:tc>
@@ -3689,7 +4455,7 @@
                 <w:color w:val="17324D"/>
                 <w:sz w:val="15"/>
               </w:rPr>
-              <w:t>Prescription saves all medicine instructions.</w:t>
+              <w:t>Forgot-password request shows a generic success message.</w:t>
             </w:r>
           </w:p>
         </w:tc>
@@ -3754,7 +4520,7 @@
                 <w:color w:val="17324D"/>
                 <w:sz w:val="15"/>
               </w:rPr>
-              <w:t>UAT-12</w:t>
+              <w:t>UAT-32</w:t>
             </w:r>
           </w:p>
         </w:tc>
@@ -3776,7 +4542,7 @@
                 <w:color w:val="17324D"/>
                 <w:sz w:val="15"/>
               </w:rPr>
-              <w:t>Doctor</w:t>
+              <w:t>All</w:t>
             </w:r>
           </w:p>
         </w:tc>
@@ -3798,7 +4564,7 @@
                 <w:color w:val="17324D"/>
                 <w:sz w:val="15"/>
               </w:rPr>
-              <w:t>Prescription PDF downloads and opens correctly.</w:t>
+              <w:t>Recovery email opens reset page and accepts a strong new password.</w:t>
             </w:r>
           </w:p>
         </w:tc>
@@ -3864,7 +4630,7 @@
                 <w:color w:val="17324D"/>
                 <w:sz w:val="15"/>
               </w:rPr>
-              <w:t>UAT-13</w:t>
+              <w:t>UAT-33</w:t>
             </w:r>
           </w:p>
         </w:tc>
@@ -3885,7 +4651,7 @@
                 <w:color w:val="17324D"/>
                 <w:sz w:val="15"/>
               </w:rPr>
-              <w:t>Doctor</w:t>
+              <w:t>All</w:t>
             </w:r>
           </w:p>
         </w:tc>
@@ -3906,7 +4672,7 @@
                 <w:color w:val="17324D"/>
                 <w:sz w:val="15"/>
               </w:rPr>
-              <w:t>Prescription Excel downloads and contains the new row.</w:t>
+              <w:t>Expired/used recovery link is rejected.</w:t>
             </w:r>
           </w:p>
         </w:tc>
@@ -3971,7 +4737,7 @@
                 <w:color w:val="17324D"/>
                 <w:sz w:val="15"/>
               </w:rPr>
-              <w:t>UAT-14</w:t>
+              <w:t>UAT-34</w:t>
             </w:r>
           </w:p>
         </w:tc>
@@ -3993,7 +4759,7 @@
                 <w:color w:val="17324D"/>
                 <w:sz w:val="15"/>
               </w:rPr>
-              <w:t>Pharmacist</w:t>
+              <w:t>Admin</w:t>
             </w:r>
           </w:p>
         </w:tc>
@@ -4015,7 +4781,7 @@
                 <w:color w:val="17324D"/>
                 <w:sz w:val="15"/>
               </w:rPr>
-              <w:t>New prescription notification appears in-app.</w:t>
+              <w:t>Hospital profile and invoice text save and reload.</w:t>
             </w:r>
           </w:p>
         </w:tc>
@@ -4081,7 +4847,7 @@
                 <w:color w:val="17324D"/>
                 <w:sz w:val="15"/>
               </w:rPr>
-              <w:t>UAT-15</w:t>
+              <w:t>UAT-35</w:t>
             </w:r>
           </w:p>
         </w:tc>
@@ -4102,7 +4868,7 @@
                 <w:color w:val="17324D"/>
                 <w:sz w:val="15"/>
               </w:rPr>
-              <w:t>Doctor</w:t>
+              <w:t>Admin</w:t>
             </w:r>
           </w:p>
         </w:tc>
@@ -4123,7 +4889,7 @@
                 <w:color w:val="17324D"/>
                 <w:sz w:val="15"/>
               </w:rPr>
-              <w:t>Lab order saves with generated order number.</w:t>
+              <w:t>Valid logo uploads; invalid type/oversize logo is rejected.</w:t>
             </w:r>
           </w:p>
         </w:tc>
@@ -4188,7 +4954,7 @@
                 <w:color w:val="17324D"/>
                 <w:sz w:val="15"/>
               </w:rPr>
-              <w:t>UAT-16</w:t>
+              <w:t>UAT-36</w:t>
             </w:r>
           </w:p>
         </w:tc>
@@ -4210,7 +4976,7 @@
                 <w:color w:val="17324D"/>
                 <w:sz w:val="15"/>
               </w:rPr>
-              <w:t>Lab Tech</w:t>
+              <w:t>Billing</w:t>
             </w:r>
           </w:p>
         </w:tc>
@@ -4232,7 +4998,7 @@
                 <w:color w:val="17324D"/>
                 <w:sz w:val="15"/>
               </w:rPr>
-              <w:t>Lab order notification appears in-app.</w:t>
+              <w:t>Draft saves without becoming outstanding patient debt.</w:t>
             </w:r>
           </w:p>
         </w:tc>
@@ -4298,7 +5064,7 @@
                 <w:color w:val="17324D"/>
                 <w:sz w:val="15"/>
               </w:rPr>
-              <w:t>UAT-17</w:t>
+              <w:t>UAT-37</w:t>
             </w:r>
           </w:p>
         </w:tc>
@@ -4319,7 +5085,7 @@
                 <w:color w:val="17324D"/>
                 <w:sz w:val="15"/>
               </w:rPr>
-              <w:t>Lab Tech</w:t>
+              <w:t>Billing</w:t>
             </w:r>
           </w:p>
         </w:tc>
@@ -4340,7 +5106,7 @@
                 <w:color w:val="17324D"/>
                 <w:sz w:val="15"/>
               </w:rPr>
-              <w:t>Result and reference range save as Completed.</w:t>
+              <w:t>Draft edit and delete work; finalized lines cannot be changed.</w:t>
             </w:r>
           </w:p>
         </w:tc>
@@ -4405,7 +5171,7 @@
                 <w:color w:val="17324D"/>
                 <w:sz w:val="15"/>
               </w:rPr>
-              <w:t>UAT-18</w:t>
+              <w:t>UAT-38</w:t>
             </w:r>
           </w:p>
         </w:tc>
@@ -4427,7 +5193,7 @@
                 <w:color w:val="17324D"/>
                 <w:sz w:val="15"/>
               </w:rPr>
-              <w:t>Doctor</w:t>
+              <w:t>Billing</w:t>
             </w:r>
           </w:p>
         </w:tc>
@@ -4449,7 +5215,7 @@
                 <w:color w:val="17324D"/>
                 <w:sz w:val="15"/>
               </w:rPr>
-              <w:t>Completed lab result notification appears.</w:t>
+              <w:t>Preview and invoice PDF show matching branding and totals.</w:t>
             </w:r>
           </w:p>
         </w:tc>
@@ -4515,7 +5281,7 @@
                 <w:color w:val="17324D"/>
                 <w:sz w:val="15"/>
               </w:rPr>
-              <w:t>UAT-19</w:t>
+              <w:t>UAT-39</w:t>
             </w:r>
           </w:p>
         </w:tc>
@@ -4536,7 +5302,7 @@
                 <w:color w:val="17324D"/>
                 <w:sz w:val="15"/>
               </w:rPr>
-              <w:t>Lab Tech</w:t>
+              <w:t>Billing</w:t>
             </w:r>
           </w:p>
         </w:tc>
@@ -4557,7 +5323,7 @@
                 <w:color w:val="17324D"/>
                 <w:sz w:val="15"/>
               </w:rPr>
-              <w:t>Lab Excel downloads and contains result data.</w:t>
+              <w:t>Cancellation requires a reason and preserves audit history.</w:t>
             </w:r>
           </w:p>
         </w:tc>
@@ -4622,7 +5388,7 @@
                 <w:color w:val="17324D"/>
                 <w:sz w:val="15"/>
               </w:rPr>
-              <w:t>UAT-20</w:t>
+              <w:t>UAT-40</w:t>
             </w:r>
           </w:p>
         </w:tc>
@@ -4644,7 +5410,7 @@
                 <w:color w:val="17324D"/>
                 <w:sz w:val="15"/>
               </w:rPr>
-              <w:t>Pharmacist</w:t>
+              <w:t>Billing</w:t>
             </w:r>
           </w:p>
         </w:tc>
@@ -4666,7 +5432,7 @@
                 <w:color w:val="17324D"/>
                 <w:sz w:val="15"/>
               </w:rPr>
-              <w:t>Stock item saves with batch, expiry and price.</w:t>
+              <w:t>Payment receipt PDF has receipt/invoice numbers and balance.</w:t>
             </w:r>
           </w:p>
         </w:tc>
@@ -4864,6 +5630,2440 @@
                 <w:color w:val="17324D"/>
                 <w:sz w:val="15"/>
               </w:rPr>
+              <w:t>UAT-41</w:t>
+            </w:r>
+          </w:p>
+        </w:tc>
+        <w:tc>
+          <w:tcPr>
+            <w:tcW w:type="dxa" w:w="1440"/>
+            <w:vAlign w:val="center"/>
+          </w:tcPr>
+          <w:p>
+            <w:pPr>
+              <w:spacing w:after="0"/>
+            </w:pPr>
+            <w:r/>
+            <w:r>
+              <w:rPr>
+                <w:rFonts w:ascii="Aptos" w:hAnsi="Aptos"/>
+                <w:b w:val="0"/>
+                <w:color w:val="17324D"/>
+                <w:sz w:val="15"/>
+              </w:rPr>
+              <w:t>Staff</w:t>
+            </w:r>
+          </w:p>
+        </w:tc>
+        <w:tc>
+          <w:tcPr>
+            <w:tcW w:type="dxa" w:w="6264"/>
+            <w:vAlign w:val="center"/>
+          </w:tcPr>
+          <w:p>
+            <w:pPr>
+              <w:spacing w:after="0"/>
+            </w:pPr>
+            <w:r/>
+            <w:r>
+              <w:rPr>
+                <w:rFonts w:ascii="Aptos" w:hAnsi="Aptos"/>
+                <w:b w:val="0"/>
+                <w:color w:val="17324D"/>
+                <w:sz w:val="15"/>
+              </w:rPr>
+              <w:t>Patient template downloads and valid CSV/XLSX imports.</w:t>
+            </w:r>
+          </w:p>
+        </w:tc>
+        <w:tc>
+          <w:tcPr>
+            <w:tcW w:type="dxa" w:w="1080"/>
+            <w:vAlign w:val="center"/>
+          </w:tcPr>
+          <w:p>
+            <w:pPr>
+              <w:spacing w:after="0"/>
+            </w:pPr>
+            <w:r/>
+            <w:r>
+              <w:rPr>
+                <w:rFonts w:ascii="Aptos" w:hAnsi="Aptos"/>
+                <w:b w:val="0"/>
+                <w:color w:val="17324D"/>
+                <w:sz w:val="15"/>
+              </w:rPr>
+              <w:t>____</w:t>
+            </w:r>
+          </w:p>
+        </w:tc>
+        <w:tc>
+          <w:tcPr>
+            <w:tcW w:type="dxa" w:w="1440"/>
+            <w:vAlign w:val="center"/>
+          </w:tcPr>
+          <w:p>
+            <w:pPr>
+              <w:spacing w:after="0"/>
+            </w:pPr>
+            <w:r/>
+            <w:r>
+              <w:rPr>
+                <w:rFonts w:ascii="Aptos" w:hAnsi="Aptos"/>
+                <w:b w:val="0"/>
+                <w:color w:val="17324D"/>
+                <w:sz w:val="15"/>
+              </w:rPr>
+            </w:r>
+          </w:p>
+        </w:tc>
+      </w:tr>
+      <w:tr>
+        <w:tc>
+          <w:tcPr>
+            <w:tcW w:type="dxa" w:w="648"/>
+            <w:vAlign w:val="center"/>
+            <w:shd w:fill="F3F5F7"/>
+          </w:tcPr>
+          <w:p>
+            <w:pPr>
+              <w:spacing w:after="0"/>
+            </w:pPr>
+            <w:r/>
+            <w:r>
+              <w:rPr>
+                <w:rFonts w:ascii="Aptos" w:hAnsi="Aptos"/>
+                <w:b w:val="0"/>
+                <w:color w:val="17324D"/>
+                <w:sz w:val="15"/>
+              </w:rPr>
+              <w:t>UAT-42</w:t>
+            </w:r>
+          </w:p>
+        </w:tc>
+        <w:tc>
+          <w:tcPr>
+            <w:tcW w:type="dxa" w:w="1440"/>
+            <w:vAlign w:val="center"/>
+            <w:shd w:fill="F3F5F7"/>
+          </w:tcPr>
+          <w:p>
+            <w:pPr>
+              <w:spacing w:after="0"/>
+            </w:pPr>
+            <w:r/>
+            <w:r>
+              <w:rPr>
+                <w:rFonts w:ascii="Aptos" w:hAnsi="Aptos"/>
+                <w:b w:val="0"/>
+                <w:color w:val="17324D"/>
+                <w:sz w:val="15"/>
+              </w:rPr>
+              <w:t>Staff</w:t>
+            </w:r>
+          </w:p>
+        </w:tc>
+        <w:tc>
+          <w:tcPr>
+            <w:tcW w:type="dxa" w:w="6264"/>
+            <w:vAlign w:val="center"/>
+            <w:shd w:fill="F3F5F7"/>
+          </w:tcPr>
+          <w:p>
+            <w:pPr>
+              <w:spacing w:after="0"/>
+            </w:pPr>
+            <w:r/>
+            <w:r>
+              <w:rPr>
+                <w:rFonts w:ascii="Aptos" w:hAnsi="Aptos"/>
+                <w:b w:val="0"/>
+                <w:color w:val="17324D"/>
+                <w:sz w:val="15"/>
+              </w:rPr>
+              <w:t>Duplicate patient is skipped with a row error.</w:t>
+            </w:r>
+          </w:p>
+        </w:tc>
+        <w:tc>
+          <w:tcPr>
+            <w:tcW w:type="dxa" w:w="1080"/>
+            <w:vAlign w:val="center"/>
+            <w:shd w:fill="F3F5F7"/>
+          </w:tcPr>
+          <w:p>
+            <w:pPr>
+              <w:spacing w:after="0"/>
+            </w:pPr>
+            <w:r/>
+            <w:r>
+              <w:rPr>
+                <w:rFonts w:ascii="Aptos" w:hAnsi="Aptos"/>
+                <w:b w:val="0"/>
+                <w:color w:val="17324D"/>
+                <w:sz w:val="15"/>
+              </w:rPr>
+              <w:t>____</w:t>
+            </w:r>
+          </w:p>
+        </w:tc>
+        <w:tc>
+          <w:tcPr>
+            <w:tcW w:type="dxa" w:w="1440"/>
+            <w:vAlign w:val="center"/>
+            <w:shd w:fill="F3F5F7"/>
+          </w:tcPr>
+          <w:p>
+            <w:pPr>
+              <w:spacing w:after="0"/>
+            </w:pPr>
+            <w:r/>
+            <w:r>
+              <w:rPr>
+                <w:rFonts w:ascii="Aptos" w:hAnsi="Aptos"/>
+                <w:b w:val="0"/>
+                <w:color w:val="17324D"/>
+                <w:sz w:val="15"/>
+              </w:rPr>
+            </w:r>
+          </w:p>
+        </w:tc>
+      </w:tr>
+      <w:tr>
+        <w:tc>
+          <w:tcPr>
+            <w:tcW w:type="dxa" w:w="648"/>
+            <w:vAlign w:val="center"/>
+          </w:tcPr>
+          <w:p>
+            <w:pPr>
+              <w:spacing w:after="0"/>
+            </w:pPr>
+            <w:r/>
+            <w:r>
+              <w:rPr>
+                <w:rFonts w:ascii="Aptos" w:hAnsi="Aptos"/>
+                <w:b w:val="0"/>
+                <w:color w:val="17324D"/>
+                <w:sz w:val="15"/>
+              </w:rPr>
+              <w:t>UAT-43</w:t>
+            </w:r>
+          </w:p>
+        </w:tc>
+        <w:tc>
+          <w:tcPr>
+            <w:tcW w:type="dxa" w:w="1440"/>
+            <w:vAlign w:val="center"/>
+          </w:tcPr>
+          <w:p>
+            <w:pPr>
+              <w:spacing w:after="0"/>
+            </w:pPr>
+            <w:r/>
+            <w:r>
+              <w:rPr>
+                <w:rFonts w:ascii="Aptos" w:hAnsi="Aptos"/>
+                <w:b w:val="0"/>
+                <w:color w:val="17324D"/>
+                <w:sz w:val="15"/>
+              </w:rPr>
+              <w:t>Pharmacist</w:t>
+            </w:r>
+          </w:p>
+        </w:tc>
+        <w:tc>
+          <w:tcPr>
+            <w:tcW w:type="dxa" w:w="6264"/>
+            <w:vAlign w:val="center"/>
+          </w:tcPr>
+          <w:p>
+            <w:pPr>
+              <w:spacing w:after="0"/>
+            </w:pPr>
+            <w:r/>
+            <w:r>
+              <w:rPr>
+                <w:rFonts w:ascii="Aptos" w:hAnsi="Aptos"/>
+                <w:b w:val="0"/>
+                <w:color w:val="17324D"/>
+                <w:sz w:val="15"/>
+              </w:rPr>
+              <w:t>Pharmacy import skips matching batch without confirmation.</w:t>
+            </w:r>
+          </w:p>
+        </w:tc>
+        <w:tc>
+          <w:tcPr>
+            <w:tcW w:type="dxa" w:w="1080"/>
+            <w:vAlign w:val="center"/>
+          </w:tcPr>
+          <w:p>
+            <w:pPr>
+              <w:spacing w:after="0"/>
+            </w:pPr>
+            <w:r/>
+            <w:r>
+              <w:rPr>
+                <w:rFonts w:ascii="Aptos" w:hAnsi="Aptos"/>
+                <w:b w:val="0"/>
+                <w:color w:val="17324D"/>
+                <w:sz w:val="15"/>
+              </w:rPr>
+              <w:t>____</w:t>
+            </w:r>
+          </w:p>
+        </w:tc>
+        <w:tc>
+          <w:tcPr>
+            <w:tcW w:type="dxa" w:w="1440"/>
+            <w:vAlign w:val="center"/>
+          </w:tcPr>
+          <w:p>
+            <w:pPr>
+              <w:spacing w:after="0"/>
+            </w:pPr>
+            <w:r/>
+            <w:r>
+              <w:rPr>
+                <w:rFonts w:ascii="Aptos" w:hAnsi="Aptos"/>
+                <w:b w:val="0"/>
+                <w:color w:val="17324D"/>
+                <w:sz w:val="15"/>
+              </w:rPr>
+            </w:r>
+          </w:p>
+        </w:tc>
+      </w:tr>
+      <w:tr>
+        <w:tc>
+          <w:tcPr>
+            <w:tcW w:type="dxa" w:w="648"/>
+            <w:vAlign w:val="center"/>
+            <w:shd w:fill="F3F5F7"/>
+          </w:tcPr>
+          <w:p>
+            <w:pPr>
+              <w:spacing w:after="0"/>
+            </w:pPr>
+            <w:r/>
+            <w:r>
+              <w:rPr>
+                <w:rFonts w:ascii="Aptos" w:hAnsi="Aptos"/>
+                <w:b w:val="0"/>
+                <w:color w:val="17324D"/>
+                <w:sz w:val="15"/>
+              </w:rPr>
+              <w:t>UAT-44</w:t>
+            </w:r>
+          </w:p>
+        </w:tc>
+        <w:tc>
+          <w:tcPr>
+            <w:tcW w:type="dxa" w:w="1440"/>
+            <w:vAlign w:val="center"/>
+            <w:shd w:fill="F3F5F7"/>
+          </w:tcPr>
+          <w:p>
+            <w:pPr>
+              <w:spacing w:after="0"/>
+            </w:pPr>
+            <w:r/>
+            <w:r>
+              <w:rPr>
+                <w:rFonts w:ascii="Aptos" w:hAnsi="Aptos"/>
+                <w:b w:val="0"/>
+                <w:color w:val="17324D"/>
+                <w:sz w:val="15"/>
+              </w:rPr>
+              <w:t>Pharmacist</w:t>
+            </w:r>
+          </w:p>
+        </w:tc>
+        <w:tc>
+          <w:tcPr>
+            <w:tcW w:type="dxa" w:w="6264"/>
+            <w:vAlign w:val="center"/>
+            <w:shd w:fill="F3F5F7"/>
+          </w:tcPr>
+          <w:p>
+            <w:pPr>
+              <w:spacing w:after="0"/>
+            </w:pPr>
+            <w:r/>
+            <w:r>
+              <w:rPr>
+                <w:rFonts w:ascii="Aptos" w:hAnsi="Aptos"/>
+                <w:b w:val="0"/>
+                <w:color w:val="17324D"/>
+                <w:sz w:val="15"/>
+              </w:rPr>
+              <w:t>Confirmed matching batch update changes intended values.</w:t>
+            </w:r>
+          </w:p>
+        </w:tc>
+        <w:tc>
+          <w:tcPr>
+            <w:tcW w:type="dxa" w:w="1080"/>
+            <w:vAlign w:val="center"/>
+            <w:shd w:fill="F3F5F7"/>
+          </w:tcPr>
+          <w:p>
+            <w:pPr>
+              <w:spacing w:after="0"/>
+            </w:pPr>
+            <w:r/>
+            <w:r>
+              <w:rPr>
+                <w:rFonts w:ascii="Aptos" w:hAnsi="Aptos"/>
+                <w:b w:val="0"/>
+                <w:color w:val="17324D"/>
+                <w:sz w:val="15"/>
+              </w:rPr>
+              <w:t>____</w:t>
+            </w:r>
+          </w:p>
+        </w:tc>
+        <w:tc>
+          <w:tcPr>
+            <w:tcW w:type="dxa" w:w="1440"/>
+            <w:vAlign w:val="center"/>
+            <w:shd w:fill="F3F5F7"/>
+          </w:tcPr>
+          <w:p>
+            <w:pPr>
+              <w:spacing w:after="0"/>
+            </w:pPr>
+            <w:r/>
+            <w:r>
+              <w:rPr>
+                <w:rFonts w:ascii="Aptos" w:hAnsi="Aptos"/>
+                <w:b w:val="0"/>
+                <w:color w:val="17324D"/>
+                <w:sz w:val="15"/>
+              </w:rPr>
+            </w:r>
+          </w:p>
+        </w:tc>
+      </w:tr>
+      <w:tr>
+        <w:tc>
+          <w:tcPr>
+            <w:tcW w:type="dxa" w:w="648"/>
+            <w:vAlign w:val="center"/>
+          </w:tcPr>
+          <w:p>
+            <w:pPr>
+              <w:spacing w:after="0"/>
+            </w:pPr>
+            <w:r/>
+            <w:r>
+              <w:rPr>
+                <w:rFonts w:ascii="Aptos" w:hAnsi="Aptos"/>
+                <w:b w:val="0"/>
+                <w:color w:val="17324D"/>
+                <w:sz w:val="15"/>
+              </w:rPr>
+              <w:t>UAT-45</w:t>
+            </w:r>
+          </w:p>
+        </w:tc>
+        <w:tc>
+          <w:tcPr>
+            <w:tcW w:type="dxa" w:w="1440"/>
+            <w:vAlign w:val="center"/>
+          </w:tcPr>
+          <w:p>
+            <w:pPr>
+              <w:spacing w:after="0"/>
+            </w:pPr>
+            <w:r/>
+            <w:r>
+              <w:rPr>
+                <w:rFonts w:ascii="Aptos" w:hAnsi="Aptos"/>
+                <w:b w:val="0"/>
+                <w:color w:val="17324D"/>
+                <w:sz w:val="15"/>
+              </w:rPr>
+              <w:t>Billing</w:t>
+            </w:r>
+          </w:p>
+        </w:tc>
+        <w:tc>
+          <w:tcPr>
+            <w:tcW w:type="dxa" w:w="6264"/>
+            <w:vAlign w:val="center"/>
+          </w:tcPr>
+          <w:p>
+            <w:pPr>
+              <w:spacing w:after="0"/>
+            </w:pPr>
+            <w:r/>
+            <w:r>
+              <w:rPr>
+                <w:rFonts w:ascii="Aptos" w:hAnsi="Aptos"/>
+                <w:b w:val="0"/>
+                <w:color w:val="17324D"/>
+                <w:sz w:val="15"/>
+              </w:rPr>
+              <w:t>Service import updates catalogue and service is selectable.</w:t>
+            </w:r>
+          </w:p>
+        </w:tc>
+        <w:tc>
+          <w:tcPr>
+            <w:tcW w:type="dxa" w:w="1080"/>
+            <w:vAlign w:val="center"/>
+          </w:tcPr>
+          <w:p>
+            <w:pPr>
+              <w:spacing w:after="0"/>
+            </w:pPr>
+            <w:r/>
+            <w:r>
+              <w:rPr>
+                <w:rFonts w:ascii="Aptos" w:hAnsi="Aptos"/>
+                <w:b w:val="0"/>
+                <w:color w:val="17324D"/>
+                <w:sz w:val="15"/>
+              </w:rPr>
+              <w:t>____</w:t>
+            </w:r>
+          </w:p>
+        </w:tc>
+        <w:tc>
+          <w:tcPr>
+            <w:tcW w:type="dxa" w:w="1440"/>
+            <w:vAlign w:val="center"/>
+          </w:tcPr>
+          <w:p>
+            <w:pPr>
+              <w:spacing w:after="0"/>
+            </w:pPr>
+            <w:r/>
+            <w:r>
+              <w:rPr>
+                <w:rFonts w:ascii="Aptos" w:hAnsi="Aptos"/>
+                <w:b w:val="0"/>
+                <w:color w:val="17324D"/>
+                <w:sz w:val="15"/>
+              </w:rPr>
+            </w:r>
+          </w:p>
+        </w:tc>
+      </w:tr>
+      <w:tr>
+        <w:tc>
+          <w:tcPr>
+            <w:tcW w:type="dxa" w:w="648"/>
+            <w:vAlign w:val="center"/>
+            <w:shd w:fill="F3F5F7"/>
+          </w:tcPr>
+          <w:p>
+            <w:pPr>
+              <w:spacing w:after="0"/>
+            </w:pPr>
+            <w:r/>
+            <w:r>
+              <w:rPr>
+                <w:rFonts w:ascii="Aptos" w:hAnsi="Aptos"/>
+                <w:b w:val="0"/>
+                <w:color w:val="17324D"/>
+                <w:sz w:val="15"/>
+              </w:rPr>
+              <w:t>UAT-46</w:t>
+            </w:r>
+          </w:p>
+        </w:tc>
+        <w:tc>
+          <w:tcPr>
+            <w:tcW w:type="dxa" w:w="1440"/>
+            <w:vAlign w:val="center"/>
+            <w:shd w:fill="F3F5F7"/>
+          </w:tcPr>
+          <w:p>
+            <w:pPr>
+              <w:spacing w:after="0"/>
+            </w:pPr>
+            <w:r/>
+            <w:r>
+              <w:rPr>
+                <w:rFonts w:ascii="Aptos" w:hAnsi="Aptos"/>
+                <w:b w:val="0"/>
+                <w:color w:val="17324D"/>
+                <w:sz w:val="15"/>
+              </w:rPr>
+              <w:t>Staff</w:t>
+            </w:r>
+          </w:p>
+        </w:tc>
+        <w:tc>
+          <w:tcPr>
+            <w:tcW w:type="dxa" w:w="6264"/>
+            <w:vAlign w:val="center"/>
+            <w:shd w:fill="F3F5F7"/>
+          </w:tcPr>
+          <w:p>
+            <w:pPr>
+              <w:spacing w:after="0"/>
+            </w:pPr>
+            <w:r/>
+            <w:r>
+              <w:rPr>
+                <w:rFonts w:ascii="Aptos" w:hAnsi="Aptos"/>
+                <w:b w:val="0"/>
+                <w:color w:val="17324D"/>
+                <w:sz w:val="15"/>
+              </w:rPr>
+              <w:t>Appointment import rejects missing MRN/doctor and conflicts.</w:t>
+            </w:r>
+          </w:p>
+        </w:tc>
+        <w:tc>
+          <w:tcPr>
+            <w:tcW w:type="dxa" w:w="1080"/>
+            <w:vAlign w:val="center"/>
+            <w:shd w:fill="F3F5F7"/>
+          </w:tcPr>
+          <w:p>
+            <w:pPr>
+              <w:spacing w:after="0"/>
+            </w:pPr>
+            <w:r/>
+            <w:r>
+              <w:rPr>
+                <w:rFonts w:ascii="Aptos" w:hAnsi="Aptos"/>
+                <w:b w:val="0"/>
+                <w:color w:val="17324D"/>
+                <w:sz w:val="15"/>
+              </w:rPr>
+              <w:t>____</w:t>
+            </w:r>
+          </w:p>
+        </w:tc>
+        <w:tc>
+          <w:tcPr>
+            <w:tcW w:type="dxa" w:w="1440"/>
+            <w:vAlign w:val="center"/>
+            <w:shd w:fill="F3F5F7"/>
+          </w:tcPr>
+          <w:p>
+            <w:pPr>
+              <w:spacing w:after="0"/>
+            </w:pPr>
+            <w:r/>
+            <w:r>
+              <w:rPr>
+                <w:rFonts w:ascii="Aptos" w:hAnsi="Aptos"/>
+                <w:b w:val="0"/>
+                <w:color w:val="17324D"/>
+                <w:sz w:val="15"/>
+              </w:rPr>
+            </w:r>
+          </w:p>
+        </w:tc>
+      </w:tr>
+      <w:tr>
+        <w:tc>
+          <w:tcPr>
+            <w:tcW w:type="dxa" w:w="648"/>
+            <w:vAlign w:val="center"/>
+          </w:tcPr>
+          <w:p>
+            <w:pPr>
+              <w:spacing w:after="0"/>
+            </w:pPr>
+            <w:r/>
+            <w:r>
+              <w:rPr>
+                <w:rFonts w:ascii="Aptos" w:hAnsi="Aptos"/>
+                <w:b w:val="0"/>
+                <w:color w:val="17324D"/>
+                <w:sz w:val="15"/>
+              </w:rPr>
+              <w:t>UAT-47</w:t>
+            </w:r>
+          </w:p>
+        </w:tc>
+        <w:tc>
+          <w:tcPr>
+            <w:tcW w:type="dxa" w:w="1440"/>
+            <w:vAlign w:val="center"/>
+          </w:tcPr>
+          <w:p>
+            <w:pPr>
+              <w:spacing w:after="0"/>
+            </w:pPr>
+            <w:r/>
+            <w:r>
+              <w:rPr>
+                <w:rFonts w:ascii="Aptos" w:hAnsi="Aptos"/>
+                <w:b w:val="0"/>
+                <w:color w:val="17324D"/>
+                <w:sz w:val="15"/>
+              </w:rPr>
+              <w:t>Doctor</w:t>
+            </w:r>
+          </w:p>
+        </w:tc>
+        <w:tc>
+          <w:tcPr>
+            <w:tcW w:type="dxa" w:w="6264"/>
+            <w:vAlign w:val="center"/>
+          </w:tcPr>
+          <w:p>
+            <w:pPr>
+              <w:spacing w:after="0"/>
+            </w:pPr>
+            <w:r/>
+            <w:r>
+              <w:rPr>
+                <w:rFonts w:ascii="Aptos" w:hAnsi="Aptos"/>
+                <w:b w:val="0"/>
+                <w:color w:val="17324D"/>
+                <w:sz w:val="15"/>
+              </w:rPr>
+              <w:t>One notification appears for each successful imported appointment.</w:t>
+            </w:r>
+          </w:p>
+        </w:tc>
+        <w:tc>
+          <w:tcPr>
+            <w:tcW w:type="dxa" w:w="1080"/>
+            <w:vAlign w:val="center"/>
+          </w:tcPr>
+          <w:p>
+            <w:pPr>
+              <w:spacing w:after="0"/>
+            </w:pPr>
+            <w:r/>
+            <w:r>
+              <w:rPr>
+                <w:rFonts w:ascii="Aptos" w:hAnsi="Aptos"/>
+                <w:b w:val="0"/>
+                <w:color w:val="17324D"/>
+                <w:sz w:val="15"/>
+              </w:rPr>
+              <w:t>____</w:t>
+            </w:r>
+          </w:p>
+        </w:tc>
+        <w:tc>
+          <w:tcPr>
+            <w:tcW w:type="dxa" w:w="1440"/>
+            <w:vAlign w:val="center"/>
+          </w:tcPr>
+          <w:p>
+            <w:pPr>
+              <w:spacing w:after="0"/>
+            </w:pPr>
+            <w:r/>
+            <w:r>
+              <w:rPr>
+                <w:rFonts w:ascii="Aptos" w:hAnsi="Aptos"/>
+                <w:b w:val="0"/>
+                <w:color w:val="17324D"/>
+                <w:sz w:val="15"/>
+              </w:rPr>
+            </w:r>
+          </w:p>
+        </w:tc>
+      </w:tr>
+      <w:tr>
+        <w:tc>
+          <w:tcPr>
+            <w:tcW w:type="dxa" w:w="648"/>
+            <w:vAlign w:val="center"/>
+            <w:shd w:fill="F3F5F7"/>
+          </w:tcPr>
+          <w:p>
+            <w:pPr>
+              <w:spacing w:after="0"/>
+            </w:pPr>
+            <w:r/>
+            <w:r>
+              <w:rPr>
+                <w:rFonts w:ascii="Aptos" w:hAnsi="Aptos"/>
+                <w:b w:val="0"/>
+                <w:color w:val="17324D"/>
+                <w:sz w:val="15"/>
+              </w:rPr>
+              <w:t>UAT-48</w:t>
+            </w:r>
+          </w:p>
+        </w:tc>
+        <w:tc>
+          <w:tcPr>
+            <w:tcW w:type="dxa" w:w="1440"/>
+            <w:vAlign w:val="center"/>
+            <w:shd w:fill="F3F5F7"/>
+          </w:tcPr>
+          <w:p>
+            <w:pPr>
+              <w:spacing w:after="0"/>
+            </w:pPr>
+            <w:r/>
+            <w:r>
+              <w:rPr>
+                <w:rFonts w:ascii="Aptos" w:hAnsi="Aptos"/>
+                <w:b w:val="0"/>
+                <w:color w:val="17324D"/>
+                <w:sz w:val="15"/>
+              </w:rPr>
+              <w:t>Admin</w:t>
+            </w:r>
+          </w:p>
+        </w:tc>
+        <w:tc>
+          <w:tcPr>
+            <w:tcW w:type="dxa" w:w="6264"/>
+            <w:vAlign w:val="center"/>
+            <w:shd w:fill="F3F5F7"/>
+          </w:tcPr>
+          <w:p>
+            <w:pPr>
+              <w:spacing w:after="0"/>
+            </w:pPr>
+            <w:r/>
+            <w:r>
+              <w:rPr>
+                <w:rFonts w:ascii="Aptos" w:hAnsi="Aptos"/>
+                <w:b w:val="0"/>
+                <w:color w:val="17324D"/>
+                <w:sz w:val="15"/>
+              </w:rPr>
+              <w:t>Staff import sends activation email without importing passwords.</w:t>
+            </w:r>
+          </w:p>
+        </w:tc>
+        <w:tc>
+          <w:tcPr>
+            <w:tcW w:type="dxa" w:w="1080"/>
+            <w:vAlign w:val="center"/>
+            <w:shd w:fill="F3F5F7"/>
+          </w:tcPr>
+          <w:p>
+            <w:pPr>
+              <w:spacing w:after="0"/>
+            </w:pPr>
+            <w:r/>
+            <w:r>
+              <w:rPr>
+                <w:rFonts w:ascii="Aptos" w:hAnsi="Aptos"/>
+                <w:b w:val="0"/>
+                <w:color w:val="17324D"/>
+                <w:sz w:val="15"/>
+              </w:rPr>
+              <w:t>____</w:t>
+            </w:r>
+          </w:p>
+        </w:tc>
+        <w:tc>
+          <w:tcPr>
+            <w:tcW w:type="dxa" w:w="1440"/>
+            <w:vAlign w:val="center"/>
+            <w:shd w:fill="F3F5F7"/>
+          </w:tcPr>
+          <w:p>
+            <w:pPr>
+              <w:spacing w:after="0"/>
+            </w:pPr>
+            <w:r/>
+            <w:r>
+              <w:rPr>
+                <w:rFonts w:ascii="Aptos" w:hAnsi="Aptos"/>
+                <w:b w:val="0"/>
+                <w:color w:val="17324D"/>
+                <w:sz w:val="15"/>
+              </w:rPr>
+            </w:r>
+          </w:p>
+        </w:tc>
+      </w:tr>
+      <w:tr>
+        <w:tc>
+          <w:tcPr>
+            <w:tcW w:type="dxa" w:w="648"/>
+            <w:vAlign w:val="center"/>
+          </w:tcPr>
+          <w:p>
+            <w:pPr>
+              <w:spacing w:after="0"/>
+            </w:pPr>
+            <w:r/>
+            <w:r>
+              <w:rPr>
+                <w:rFonts w:ascii="Aptos" w:hAnsi="Aptos"/>
+                <w:b w:val="0"/>
+                <w:color w:val="17324D"/>
+                <w:sz w:val="15"/>
+              </w:rPr>
+              <w:t>UAT-49</w:t>
+            </w:r>
+          </w:p>
+        </w:tc>
+        <w:tc>
+          <w:tcPr>
+            <w:tcW w:type="dxa" w:w="1440"/>
+            <w:vAlign w:val="center"/>
+          </w:tcPr>
+          <w:p>
+            <w:pPr>
+              <w:spacing w:after="0"/>
+            </w:pPr>
+            <w:r/>
+            <w:r>
+              <w:rPr>
+                <w:rFonts w:ascii="Aptos" w:hAnsi="Aptos"/>
+                <w:b w:val="0"/>
+                <w:color w:val="17324D"/>
+                <w:sz w:val="15"/>
+              </w:rPr>
+              <w:t>All</w:t>
+            </w:r>
+          </w:p>
+        </w:tc>
+        <w:tc>
+          <w:tcPr>
+            <w:tcW w:type="dxa" w:w="6264"/>
+            <w:vAlign w:val="center"/>
+          </w:tcPr>
+          <w:p>
+            <w:pPr>
+              <w:spacing w:after="0"/>
+            </w:pPr>
+            <w:r/>
+            <w:r>
+              <w:rPr>
+                <w:rFonts w:ascii="Aptos" w:hAnsi="Aptos"/>
+                <w:b w:val="0"/>
+                <w:color w:val="17324D"/>
+                <w:sz w:val="15"/>
+              </w:rPr>
+              <w:t>Formula, invalid-file and oversized-file imports are rejected.</w:t>
+            </w:r>
+          </w:p>
+        </w:tc>
+        <w:tc>
+          <w:tcPr>
+            <w:tcW w:type="dxa" w:w="1080"/>
+            <w:vAlign w:val="center"/>
+          </w:tcPr>
+          <w:p>
+            <w:pPr>
+              <w:spacing w:after="0"/>
+            </w:pPr>
+            <w:r/>
+            <w:r>
+              <w:rPr>
+                <w:rFonts w:ascii="Aptos" w:hAnsi="Aptos"/>
+                <w:b w:val="0"/>
+                <w:color w:val="17324D"/>
+                <w:sz w:val="15"/>
+              </w:rPr>
+              <w:t>____</w:t>
+            </w:r>
+          </w:p>
+        </w:tc>
+        <w:tc>
+          <w:tcPr>
+            <w:tcW w:type="dxa" w:w="1440"/>
+            <w:vAlign w:val="center"/>
+          </w:tcPr>
+          <w:p>
+            <w:pPr>
+              <w:spacing w:after="0"/>
+            </w:pPr>
+            <w:r/>
+            <w:r>
+              <w:rPr>
+                <w:rFonts w:ascii="Aptos" w:hAnsi="Aptos"/>
+                <w:b w:val="0"/>
+                <w:color w:val="17324D"/>
+                <w:sz w:val="15"/>
+              </w:rPr>
+            </w:r>
+          </w:p>
+        </w:tc>
+      </w:tr>
+      <w:tr>
+        <w:tc>
+          <w:tcPr>
+            <w:tcW w:type="dxa" w:w="648"/>
+            <w:vAlign w:val="center"/>
+            <w:shd w:fill="F3F5F7"/>
+          </w:tcPr>
+          <w:p>
+            <w:pPr>
+              <w:spacing w:after="0"/>
+            </w:pPr>
+            <w:r/>
+            <w:r>
+              <w:rPr>
+                <w:rFonts w:ascii="Aptos" w:hAnsi="Aptos"/>
+                <w:b w:val="0"/>
+                <w:color w:val="17324D"/>
+                <w:sz w:val="15"/>
+              </w:rPr>
+              <w:t>UAT-50</w:t>
+            </w:r>
+          </w:p>
+        </w:tc>
+        <w:tc>
+          <w:tcPr>
+            <w:tcW w:type="dxa" w:w="1440"/>
+            <w:vAlign w:val="center"/>
+            <w:shd w:fill="F3F5F7"/>
+          </w:tcPr>
+          <w:p>
+            <w:pPr>
+              <w:spacing w:after="0"/>
+            </w:pPr>
+            <w:r/>
+            <w:r>
+              <w:rPr>
+                <w:rFonts w:ascii="Aptos" w:hAnsi="Aptos"/>
+                <w:b w:val="0"/>
+                <w:color w:val="17324D"/>
+                <w:sz w:val="15"/>
+              </w:rPr>
+              <w:t>All</w:t>
+            </w:r>
+          </w:p>
+        </w:tc>
+        <w:tc>
+          <w:tcPr>
+            <w:tcW w:type="dxa" w:w="6264"/>
+            <w:vAlign w:val="center"/>
+            <w:shd w:fill="F3F5F7"/>
+          </w:tcPr>
+          <w:p>
+            <w:pPr>
+              <w:spacing w:after="0"/>
+            </w:pPr>
+            <w:r/>
+            <w:r>
+              <w:rPr>
+                <w:rFonts w:ascii="Aptos" w:hAnsi="Aptos"/>
+                <w:b w:val="0"/>
+                <w:color w:val="17324D"/>
+                <w:sz w:val="15"/>
+              </w:rPr>
+              <w:t>Unauthorized roles cannot see or execute import/settings actions.</w:t>
+            </w:r>
+          </w:p>
+        </w:tc>
+        <w:tc>
+          <w:tcPr>
+            <w:tcW w:type="dxa" w:w="1080"/>
+            <w:vAlign w:val="center"/>
+            <w:shd w:fill="F3F5F7"/>
+          </w:tcPr>
+          <w:p>
+            <w:pPr>
+              <w:spacing w:after="0"/>
+            </w:pPr>
+            <w:r/>
+            <w:r>
+              <w:rPr>
+                <w:rFonts w:ascii="Aptos" w:hAnsi="Aptos"/>
+                <w:b w:val="0"/>
+                <w:color w:val="17324D"/>
+                <w:sz w:val="15"/>
+              </w:rPr>
+              <w:t>____</w:t>
+            </w:r>
+          </w:p>
+        </w:tc>
+        <w:tc>
+          <w:tcPr>
+            <w:tcW w:type="dxa" w:w="1440"/>
+            <w:vAlign w:val="center"/>
+            <w:shd w:fill="F3F5F7"/>
+          </w:tcPr>
+          <w:p>
+            <w:pPr>
+              <w:spacing w:after="0"/>
+            </w:pPr>
+            <w:r/>
+            <w:r>
+              <w:rPr>
+                <w:rFonts w:ascii="Aptos" w:hAnsi="Aptos"/>
+                <w:b w:val="0"/>
+                <w:color w:val="17324D"/>
+                <w:sz w:val="15"/>
+              </w:rPr>
+            </w:r>
+          </w:p>
+        </w:tc>
+      </w:tr>
+    </w:tbl>
+    <w:p>
+      <w:pPr>
+        <w:spacing w:after="0"/>
+      </w:pPr>
+    </w:p>
+    <w:tbl>
+      <w:tblPr>
+        <w:tblStyle w:val="TableGrid"/>
+        <w:tblW w:type="auto" w:w="0"/>
+        <w:jc w:val="center"/>
+        <w:tblLook w:firstColumn="1" w:firstRow="1" w:lastColumn="0" w:lastRow="0" w:noHBand="0" w:noVBand="1" w:val="04A0"/>
+      </w:tblPr>
+      <w:tblGrid>
+        <w:gridCol w:w="2033"/>
+        <w:gridCol w:w="2033"/>
+        <w:gridCol w:w="2033"/>
+        <w:gridCol w:w="2033"/>
+        <w:gridCol w:w="2033"/>
+      </w:tblGrid>
+      <w:tr>
+        <w:tc>
+          <w:tcPr>
+            <w:tcW w:type="dxa" w:w="648"/>
+            <w:vAlign w:val="center"/>
+            <w:shd w:fill="0F766E"/>
+          </w:tcPr>
+          <w:p>
+            <w:pPr>
+              <w:spacing w:after="0"/>
+            </w:pPr>
+            <w:r/>
+            <w:r>
+              <w:rPr>
+                <w:rFonts w:ascii="Aptos" w:hAnsi="Aptos"/>
+                <w:b/>
+                <w:color w:val="FFFFFF"/>
+                <w:sz w:val="15"/>
+              </w:rPr>
+              <w:t>ID</w:t>
+            </w:r>
+          </w:p>
+        </w:tc>
+        <w:tc>
+          <w:tcPr>
+            <w:tcW w:type="dxa" w:w="1440"/>
+            <w:vAlign w:val="center"/>
+            <w:shd w:fill="0F766E"/>
+          </w:tcPr>
+          <w:p>
+            <w:pPr>
+              <w:spacing w:after="0"/>
+            </w:pPr>
+            <w:r/>
+            <w:r>
+              <w:rPr>
+                <w:rFonts w:ascii="Aptos" w:hAnsi="Aptos"/>
+                <w:b/>
+                <w:color w:val="FFFFFF"/>
+                <w:sz w:val="15"/>
+              </w:rPr>
+              <w:t>Role</w:t>
+            </w:r>
+          </w:p>
+        </w:tc>
+        <w:tc>
+          <w:tcPr>
+            <w:tcW w:type="dxa" w:w="6264"/>
+            <w:vAlign w:val="center"/>
+            <w:shd w:fill="0F766E"/>
+          </w:tcPr>
+          <w:p>
+            <w:pPr>
+              <w:spacing w:after="0"/>
+            </w:pPr>
+            <w:r/>
+            <w:r>
+              <w:rPr>
+                <w:rFonts w:ascii="Aptos" w:hAnsi="Aptos"/>
+                <w:b/>
+                <w:color w:val="FFFFFF"/>
+                <w:sz w:val="15"/>
+              </w:rPr>
+              <w:t>Test and expected result</w:t>
+            </w:r>
+          </w:p>
+        </w:tc>
+        <w:tc>
+          <w:tcPr>
+            <w:tcW w:type="dxa" w:w="1080"/>
+            <w:vAlign w:val="center"/>
+            <w:shd w:fill="0F766E"/>
+          </w:tcPr>
+          <w:p>
+            <w:pPr>
+              <w:spacing w:after="0"/>
+            </w:pPr>
+            <w:r/>
+            <w:r>
+              <w:rPr>
+                <w:rFonts w:ascii="Aptos" w:hAnsi="Aptos"/>
+                <w:b/>
+                <w:color w:val="FFFFFF"/>
+                <w:sz w:val="15"/>
+              </w:rPr>
+              <w:t>Result</w:t>
+            </w:r>
+          </w:p>
+        </w:tc>
+        <w:tc>
+          <w:tcPr>
+            <w:tcW w:type="dxa" w:w="1440"/>
+            <w:vAlign w:val="center"/>
+            <w:shd w:fill="0F766E"/>
+          </w:tcPr>
+          <w:p>
+            <w:pPr>
+              <w:spacing w:after="0"/>
+            </w:pPr>
+            <w:r/>
+            <w:r>
+              <w:rPr>
+                <w:rFonts w:ascii="Aptos" w:hAnsi="Aptos"/>
+                <w:b/>
+                <w:color w:val="FFFFFF"/>
+                <w:sz w:val="15"/>
+              </w:rPr>
+              <w:t>Notes</w:t>
+            </w:r>
+          </w:p>
+        </w:tc>
+      </w:tr>
+      <w:tr>
+        <w:tc>
+          <w:tcPr>
+            <w:tcW w:type="dxa" w:w="648"/>
+            <w:vAlign w:val="center"/>
+          </w:tcPr>
+          <w:p>
+            <w:pPr>
+              <w:spacing w:after="0"/>
+            </w:pPr>
+            <w:r/>
+            <w:r>
+              <w:rPr>
+                <w:rFonts w:ascii="Aptos" w:hAnsi="Aptos"/>
+                <w:b w:val="0"/>
+                <w:color w:val="17324D"/>
+                <w:sz w:val="15"/>
+              </w:rPr>
+              <w:t>UAT-11</w:t>
+            </w:r>
+          </w:p>
+        </w:tc>
+        <w:tc>
+          <w:tcPr>
+            <w:tcW w:type="dxa" w:w="1440"/>
+            <w:vAlign w:val="center"/>
+          </w:tcPr>
+          <w:p>
+            <w:pPr>
+              <w:spacing w:after="0"/>
+            </w:pPr>
+            <w:r/>
+            <w:r>
+              <w:rPr>
+                <w:rFonts w:ascii="Aptos" w:hAnsi="Aptos"/>
+                <w:b w:val="0"/>
+                <w:color w:val="17324D"/>
+                <w:sz w:val="15"/>
+              </w:rPr>
+              <w:t>Doctor</w:t>
+            </w:r>
+          </w:p>
+        </w:tc>
+        <w:tc>
+          <w:tcPr>
+            <w:tcW w:type="dxa" w:w="6264"/>
+            <w:vAlign w:val="center"/>
+          </w:tcPr>
+          <w:p>
+            <w:pPr>
+              <w:spacing w:after="0"/>
+            </w:pPr>
+            <w:r/>
+            <w:r>
+              <w:rPr>
+                <w:rFonts w:ascii="Aptos" w:hAnsi="Aptos"/>
+                <w:b w:val="0"/>
+                <w:color w:val="17324D"/>
+                <w:sz w:val="15"/>
+              </w:rPr>
+              <w:t>Prescription saves all medicine instructions.</w:t>
+            </w:r>
+          </w:p>
+        </w:tc>
+        <w:tc>
+          <w:tcPr>
+            <w:tcW w:type="dxa" w:w="1080"/>
+            <w:vAlign w:val="center"/>
+          </w:tcPr>
+          <w:p>
+            <w:pPr>
+              <w:spacing w:after="0"/>
+            </w:pPr>
+            <w:r/>
+            <w:r>
+              <w:rPr>
+                <w:rFonts w:ascii="Aptos" w:hAnsi="Aptos"/>
+                <w:b w:val="0"/>
+                <w:color w:val="17324D"/>
+                <w:sz w:val="15"/>
+              </w:rPr>
+              <w:t>____</w:t>
+            </w:r>
+          </w:p>
+        </w:tc>
+        <w:tc>
+          <w:tcPr>
+            <w:tcW w:type="dxa" w:w="1440"/>
+            <w:vAlign w:val="center"/>
+          </w:tcPr>
+          <w:p>
+            <w:pPr>
+              <w:spacing w:after="0"/>
+            </w:pPr>
+            <w:r/>
+            <w:r>
+              <w:rPr>
+                <w:rFonts w:ascii="Aptos" w:hAnsi="Aptos"/>
+                <w:b w:val="0"/>
+                <w:color w:val="17324D"/>
+                <w:sz w:val="15"/>
+              </w:rPr>
+            </w:r>
+          </w:p>
+        </w:tc>
+      </w:tr>
+      <w:tr>
+        <w:tc>
+          <w:tcPr>
+            <w:tcW w:type="dxa" w:w="648"/>
+            <w:vAlign w:val="center"/>
+            <w:shd w:fill="F3F5F7"/>
+          </w:tcPr>
+          <w:p>
+            <w:pPr>
+              <w:spacing w:after="0"/>
+            </w:pPr>
+            <w:r/>
+            <w:r>
+              <w:rPr>
+                <w:rFonts w:ascii="Aptos" w:hAnsi="Aptos"/>
+                <w:b w:val="0"/>
+                <w:color w:val="17324D"/>
+                <w:sz w:val="15"/>
+              </w:rPr>
+              <w:t>UAT-12</w:t>
+            </w:r>
+          </w:p>
+        </w:tc>
+        <w:tc>
+          <w:tcPr>
+            <w:tcW w:type="dxa" w:w="1440"/>
+            <w:vAlign w:val="center"/>
+            <w:shd w:fill="F3F5F7"/>
+          </w:tcPr>
+          <w:p>
+            <w:pPr>
+              <w:spacing w:after="0"/>
+            </w:pPr>
+            <w:r/>
+            <w:r>
+              <w:rPr>
+                <w:rFonts w:ascii="Aptos" w:hAnsi="Aptos"/>
+                <w:b w:val="0"/>
+                <w:color w:val="17324D"/>
+                <w:sz w:val="15"/>
+              </w:rPr>
+              <w:t>Doctor</w:t>
+            </w:r>
+          </w:p>
+        </w:tc>
+        <w:tc>
+          <w:tcPr>
+            <w:tcW w:type="dxa" w:w="6264"/>
+            <w:vAlign w:val="center"/>
+            <w:shd w:fill="F3F5F7"/>
+          </w:tcPr>
+          <w:p>
+            <w:pPr>
+              <w:spacing w:after="0"/>
+            </w:pPr>
+            <w:r/>
+            <w:r>
+              <w:rPr>
+                <w:rFonts w:ascii="Aptos" w:hAnsi="Aptos"/>
+                <w:b w:val="0"/>
+                <w:color w:val="17324D"/>
+                <w:sz w:val="15"/>
+              </w:rPr>
+              <w:t>Prescription PDF downloads and opens correctly.</w:t>
+            </w:r>
+          </w:p>
+        </w:tc>
+        <w:tc>
+          <w:tcPr>
+            <w:tcW w:type="dxa" w:w="1080"/>
+            <w:vAlign w:val="center"/>
+            <w:shd w:fill="F3F5F7"/>
+          </w:tcPr>
+          <w:p>
+            <w:pPr>
+              <w:spacing w:after="0"/>
+            </w:pPr>
+            <w:r/>
+            <w:r>
+              <w:rPr>
+                <w:rFonts w:ascii="Aptos" w:hAnsi="Aptos"/>
+                <w:b w:val="0"/>
+                <w:color w:val="17324D"/>
+                <w:sz w:val="15"/>
+              </w:rPr>
+              <w:t>____</w:t>
+            </w:r>
+          </w:p>
+        </w:tc>
+        <w:tc>
+          <w:tcPr>
+            <w:tcW w:type="dxa" w:w="1440"/>
+            <w:vAlign w:val="center"/>
+            <w:shd w:fill="F3F5F7"/>
+          </w:tcPr>
+          <w:p>
+            <w:pPr>
+              <w:spacing w:after="0"/>
+            </w:pPr>
+            <w:r/>
+            <w:r>
+              <w:rPr>
+                <w:rFonts w:ascii="Aptos" w:hAnsi="Aptos"/>
+                <w:b w:val="0"/>
+                <w:color w:val="17324D"/>
+                <w:sz w:val="15"/>
+              </w:rPr>
+            </w:r>
+          </w:p>
+        </w:tc>
+      </w:tr>
+      <w:tr>
+        <w:tc>
+          <w:tcPr>
+            <w:tcW w:type="dxa" w:w="648"/>
+            <w:vAlign w:val="center"/>
+          </w:tcPr>
+          <w:p>
+            <w:pPr>
+              <w:spacing w:after="0"/>
+            </w:pPr>
+            <w:r/>
+            <w:r>
+              <w:rPr>
+                <w:rFonts w:ascii="Aptos" w:hAnsi="Aptos"/>
+                <w:b w:val="0"/>
+                <w:color w:val="17324D"/>
+                <w:sz w:val="15"/>
+              </w:rPr>
+              <w:t>UAT-13</w:t>
+            </w:r>
+          </w:p>
+        </w:tc>
+        <w:tc>
+          <w:tcPr>
+            <w:tcW w:type="dxa" w:w="1440"/>
+            <w:vAlign w:val="center"/>
+          </w:tcPr>
+          <w:p>
+            <w:pPr>
+              <w:spacing w:after="0"/>
+            </w:pPr>
+            <w:r/>
+            <w:r>
+              <w:rPr>
+                <w:rFonts w:ascii="Aptos" w:hAnsi="Aptos"/>
+                <w:b w:val="0"/>
+                <w:color w:val="17324D"/>
+                <w:sz w:val="15"/>
+              </w:rPr>
+              <w:t>Doctor</w:t>
+            </w:r>
+          </w:p>
+        </w:tc>
+        <w:tc>
+          <w:tcPr>
+            <w:tcW w:type="dxa" w:w="6264"/>
+            <w:vAlign w:val="center"/>
+          </w:tcPr>
+          <w:p>
+            <w:pPr>
+              <w:spacing w:after="0"/>
+            </w:pPr>
+            <w:r/>
+            <w:r>
+              <w:rPr>
+                <w:rFonts w:ascii="Aptos" w:hAnsi="Aptos"/>
+                <w:b w:val="0"/>
+                <w:color w:val="17324D"/>
+                <w:sz w:val="15"/>
+              </w:rPr>
+              <w:t>Prescription Excel downloads and contains the new row.</w:t>
+            </w:r>
+          </w:p>
+        </w:tc>
+        <w:tc>
+          <w:tcPr>
+            <w:tcW w:type="dxa" w:w="1080"/>
+            <w:vAlign w:val="center"/>
+          </w:tcPr>
+          <w:p>
+            <w:pPr>
+              <w:spacing w:after="0"/>
+            </w:pPr>
+            <w:r/>
+            <w:r>
+              <w:rPr>
+                <w:rFonts w:ascii="Aptos" w:hAnsi="Aptos"/>
+                <w:b w:val="0"/>
+                <w:color w:val="17324D"/>
+                <w:sz w:val="15"/>
+              </w:rPr>
+              <w:t>____</w:t>
+            </w:r>
+          </w:p>
+        </w:tc>
+        <w:tc>
+          <w:tcPr>
+            <w:tcW w:type="dxa" w:w="1440"/>
+            <w:vAlign w:val="center"/>
+          </w:tcPr>
+          <w:p>
+            <w:pPr>
+              <w:spacing w:after="0"/>
+            </w:pPr>
+            <w:r/>
+            <w:r>
+              <w:rPr>
+                <w:rFonts w:ascii="Aptos" w:hAnsi="Aptos"/>
+                <w:b w:val="0"/>
+                <w:color w:val="17324D"/>
+                <w:sz w:val="15"/>
+              </w:rPr>
+            </w:r>
+          </w:p>
+        </w:tc>
+      </w:tr>
+      <w:tr>
+        <w:tc>
+          <w:tcPr>
+            <w:tcW w:type="dxa" w:w="648"/>
+            <w:vAlign w:val="center"/>
+            <w:shd w:fill="F3F5F7"/>
+          </w:tcPr>
+          <w:p>
+            <w:pPr>
+              <w:spacing w:after="0"/>
+            </w:pPr>
+            <w:r/>
+            <w:r>
+              <w:rPr>
+                <w:rFonts w:ascii="Aptos" w:hAnsi="Aptos"/>
+                <w:b w:val="0"/>
+                <w:color w:val="17324D"/>
+                <w:sz w:val="15"/>
+              </w:rPr>
+              <w:t>UAT-14</w:t>
+            </w:r>
+          </w:p>
+        </w:tc>
+        <w:tc>
+          <w:tcPr>
+            <w:tcW w:type="dxa" w:w="1440"/>
+            <w:vAlign w:val="center"/>
+            <w:shd w:fill="F3F5F7"/>
+          </w:tcPr>
+          <w:p>
+            <w:pPr>
+              <w:spacing w:after="0"/>
+            </w:pPr>
+            <w:r/>
+            <w:r>
+              <w:rPr>
+                <w:rFonts w:ascii="Aptos" w:hAnsi="Aptos"/>
+                <w:b w:val="0"/>
+                <w:color w:val="17324D"/>
+                <w:sz w:val="15"/>
+              </w:rPr>
+              <w:t>Pharmacist</w:t>
+            </w:r>
+          </w:p>
+        </w:tc>
+        <w:tc>
+          <w:tcPr>
+            <w:tcW w:type="dxa" w:w="6264"/>
+            <w:vAlign w:val="center"/>
+            <w:shd w:fill="F3F5F7"/>
+          </w:tcPr>
+          <w:p>
+            <w:pPr>
+              <w:spacing w:after="0"/>
+            </w:pPr>
+            <w:r/>
+            <w:r>
+              <w:rPr>
+                <w:rFonts w:ascii="Aptos" w:hAnsi="Aptos"/>
+                <w:b w:val="0"/>
+                <w:color w:val="17324D"/>
+                <w:sz w:val="15"/>
+              </w:rPr>
+              <w:t>New prescription notification appears in-app.</w:t>
+            </w:r>
+          </w:p>
+        </w:tc>
+        <w:tc>
+          <w:tcPr>
+            <w:tcW w:type="dxa" w:w="1080"/>
+            <w:vAlign w:val="center"/>
+            <w:shd w:fill="F3F5F7"/>
+          </w:tcPr>
+          <w:p>
+            <w:pPr>
+              <w:spacing w:after="0"/>
+            </w:pPr>
+            <w:r/>
+            <w:r>
+              <w:rPr>
+                <w:rFonts w:ascii="Aptos" w:hAnsi="Aptos"/>
+                <w:b w:val="0"/>
+                <w:color w:val="17324D"/>
+                <w:sz w:val="15"/>
+              </w:rPr>
+              <w:t>____</w:t>
+            </w:r>
+          </w:p>
+        </w:tc>
+        <w:tc>
+          <w:tcPr>
+            <w:tcW w:type="dxa" w:w="1440"/>
+            <w:vAlign w:val="center"/>
+            <w:shd w:fill="F3F5F7"/>
+          </w:tcPr>
+          <w:p>
+            <w:pPr>
+              <w:spacing w:after="0"/>
+            </w:pPr>
+            <w:r/>
+            <w:r>
+              <w:rPr>
+                <w:rFonts w:ascii="Aptos" w:hAnsi="Aptos"/>
+                <w:b w:val="0"/>
+                <w:color w:val="17324D"/>
+                <w:sz w:val="15"/>
+              </w:rPr>
+            </w:r>
+          </w:p>
+        </w:tc>
+      </w:tr>
+      <w:tr>
+        <w:tc>
+          <w:tcPr>
+            <w:tcW w:type="dxa" w:w="648"/>
+            <w:vAlign w:val="center"/>
+          </w:tcPr>
+          <w:p>
+            <w:pPr>
+              <w:spacing w:after="0"/>
+            </w:pPr>
+            <w:r/>
+            <w:r>
+              <w:rPr>
+                <w:rFonts w:ascii="Aptos" w:hAnsi="Aptos"/>
+                <w:b w:val="0"/>
+                <w:color w:val="17324D"/>
+                <w:sz w:val="15"/>
+              </w:rPr>
+              <w:t>UAT-15</w:t>
+            </w:r>
+          </w:p>
+        </w:tc>
+        <w:tc>
+          <w:tcPr>
+            <w:tcW w:type="dxa" w:w="1440"/>
+            <w:vAlign w:val="center"/>
+          </w:tcPr>
+          <w:p>
+            <w:pPr>
+              <w:spacing w:after="0"/>
+            </w:pPr>
+            <w:r/>
+            <w:r>
+              <w:rPr>
+                <w:rFonts w:ascii="Aptos" w:hAnsi="Aptos"/>
+                <w:b w:val="0"/>
+                <w:color w:val="17324D"/>
+                <w:sz w:val="15"/>
+              </w:rPr>
+              <w:t>Doctor</w:t>
+            </w:r>
+          </w:p>
+        </w:tc>
+        <w:tc>
+          <w:tcPr>
+            <w:tcW w:type="dxa" w:w="6264"/>
+            <w:vAlign w:val="center"/>
+          </w:tcPr>
+          <w:p>
+            <w:pPr>
+              <w:spacing w:after="0"/>
+            </w:pPr>
+            <w:r/>
+            <w:r>
+              <w:rPr>
+                <w:rFonts w:ascii="Aptos" w:hAnsi="Aptos"/>
+                <w:b w:val="0"/>
+                <w:color w:val="17324D"/>
+                <w:sz w:val="15"/>
+              </w:rPr>
+              <w:t>Lab order saves with generated order number.</w:t>
+            </w:r>
+          </w:p>
+        </w:tc>
+        <w:tc>
+          <w:tcPr>
+            <w:tcW w:type="dxa" w:w="1080"/>
+            <w:vAlign w:val="center"/>
+          </w:tcPr>
+          <w:p>
+            <w:pPr>
+              <w:spacing w:after="0"/>
+            </w:pPr>
+            <w:r/>
+            <w:r>
+              <w:rPr>
+                <w:rFonts w:ascii="Aptos" w:hAnsi="Aptos"/>
+                <w:b w:val="0"/>
+                <w:color w:val="17324D"/>
+                <w:sz w:val="15"/>
+              </w:rPr>
+              <w:t>____</w:t>
+            </w:r>
+          </w:p>
+        </w:tc>
+        <w:tc>
+          <w:tcPr>
+            <w:tcW w:type="dxa" w:w="1440"/>
+            <w:vAlign w:val="center"/>
+          </w:tcPr>
+          <w:p>
+            <w:pPr>
+              <w:spacing w:after="0"/>
+            </w:pPr>
+            <w:r/>
+            <w:r>
+              <w:rPr>
+                <w:rFonts w:ascii="Aptos" w:hAnsi="Aptos"/>
+                <w:b w:val="0"/>
+                <w:color w:val="17324D"/>
+                <w:sz w:val="15"/>
+              </w:rPr>
+            </w:r>
+          </w:p>
+        </w:tc>
+      </w:tr>
+      <w:tr>
+        <w:tc>
+          <w:tcPr>
+            <w:tcW w:type="dxa" w:w="648"/>
+            <w:vAlign w:val="center"/>
+            <w:shd w:fill="F3F5F7"/>
+          </w:tcPr>
+          <w:p>
+            <w:pPr>
+              <w:spacing w:after="0"/>
+            </w:pPr>
+            <w:r/>
+            <w:r>
+              <w:rPr>
+                <w:rFonts w:ascii="Aptos" w:hAnsi="Aptos"/>
+                <w:b w:val="0"/>
+                <w:color w:val="17324D"/>
+                <w:sz w:val="15"/>
+              </w:rPr>
+              <w:t>UAT-16</w:t>
+            </w:r>
+          </w:p>
+        </w:tc>
+        <w:tc>
+          <w:tcPr>
+            <w:tcW w:type="dxa" w:w="1440"/>
+            <w:vAlign w:val="center"/>
+            <w:shd w:fill="F3F5F7"/>
+          </w:tcPr>
+          <w:p>
+            <w:pPr>
+              <w:spacing w:after="0"/>
+            </w:pPr>
+            <w:r/>
+            <w:r>
+              <w:rPr>
+                <w:rFonts w:ascii="Aptos" w:hAnsi="Aptos"/>
+                <w:b w:val="0"/>
+                <w:color w:val="17324D"/>
+                <w:sz w:val="15"/>
+              </w:rPr>
+              <w:t>Lab Tech</w:t>
+            </w:r>
+          </w:p>
+        </w:tc>
+        <w:tc>
+          <w:tcPr>
+            <w:tcW w:type="dxa" w:w="6264"/>
+            <w:vAlign w:val="center"/>
+            <w:shd w:fill="F3F5F7"/>
+          </w:tcPr>
+          <w:p>
+            <w:pPr>
+              <w:spacing w:after="0"/>
+            </w:pPr>
+            <w:r/>
+            <w:r>
+              <w:rPr>
+                <w:rFonts w:ascii="Aptos" w:hAnsi="Aptos"/>
+                <w:b w:val="0"/>
+                <w:color w:val="17324D"/>
+                <w:sz w:val="15"/>
+              </w:rPr>
+              <w:t>Lab order notification appears in-app.</w:t>
+            </w:r>
+          </w:p>
+        </w:tc>
+        <w:tc>
+          <w:tcPr>
+            <w:tcW w:type="dxa" w:w="1080"/>
+            <w:vAlign w:val="center"/>
+            <w:shd w:fill="F3F5F7"/>
+          </w:tcPr>
+          <w:p>
+            <w:pPr>
+              <w:spacing w:after="0"/>
+            </w:pPr>
+            <w:r/>
+            <w:r>
+              <w:rPr>
+                <w:rFonts w:ascii="Aptos" w:hAnsi="Aptos"/>
+                <w:b w:val="0"/>
+                <w:color w:val="17324D"/>
+                <w:sz w:val="15"/>
+              </w:rPr>
+              <w:t>____</w:t>
+            </w:r>
+          </w:p>
+        </w:tc>
+        <w:tc>
+          <w:tcPr>
+            <w:tcW w:type="dxa" w:w="1440"/>
+            <w:vAlign w:val="center"/>
+            <w:shd w:fill="F3F5F7"/>
+          </w:tcPr>
+          <w:p>
+            <w:pPr>
+              <w:spacing w:after="0"/>
+            </w:pPr>
+            <w:r/>
+            <w:r>
+              <w:rPr>
+                <w:rFonts w:ascii="Aptos" w:hAnsi="Aptos"/>
+                <w:b w:val="0"/>
+                <w:color w:val="17324D"/>
+                <w:sz w:val="15"/>
+              </w:rPr>
+            </w:r>
+          </w:p>
+        </w:tc>
+      </w:tr>
+      <w:tr>
+        <w:tc>
+          <w:tcPr>
+            <w:tcW w:type="dxa" w:w="648"/>
+            <w:vAlign w:val="center"/>
+          </w:tcPr>
+          <w:p>
+            <w:pPr>
+              <w:spacing w:after="0"/>
+            </w:pPr>
+            <w:r/>
+            <w:r>
+              <w:rPr>
+                <w:rFonts w:ascii="Aptos" w:hAnsi="Aptos"/>
+                <w:b w:val="0"/>
+                <w:color w:val="17324D"/>
+                <w:sz w:val="15"/>
+              </w:rPr>
+              <w:t>UAT-17</w:t>
+            </w:r>
+          </w:p>
+        </w:tc>
+        <w:tc>
+          <w:tcPr>
+            <w:tcW w:type="dxa" w:w="1440"/>
+            <w:vAlign w:val="center"/>
+          </w:tcPr>
+          <w:p>
+            <w:pPr>
+              <w:spacing w:after="0"/>
+            </w:pPr>
+            <w:r/>
+            <w:r>
+              <w:rPr>
+                <w:rFonts w:ascii="Aptos" w:hAnsi="Aptos"/>
+                <w:b w:val="0"/>
+                <w:color w:val="17324D"/>
+                <w:sz w:val="15"/>
+              </w:rPr>
+              <w:t>Lab Tech</w:t>
+            </w:r>
+          </w:p>
+        </w:tc>
+        <w:tc>
+          <w:tcPr>
+            <w:tcW w:type="dxa" w:w="6264"/>
+            <w:vAlign w:val="center"/>
+          </w:tcPr>
+          <w:p>
+            <w:pPr>
+              <w:spacing w:after="0"/>
+            </w:pPr>
+            <w:r/>
+            <w:r>
+              <w:rPr>
+                <w:rFonts w:ascii="Aptos" w:hAnsi="Aptos"/>
+                <w:b w:val="0"/>
+                <w:color w:val="17324D"/>
+                <w:sz w:val="15"/>
+              </w:rPr>
+              <w:t>Result and reference range save as Completed.</w:t>
+            </w:r>
+          </w:p>
+        </w:tc>
+        <w:tc>
+          <w:tcPr>
+            <w:tcW w:type="dxa" w:w="1080"/>
+            <w:vAlign w:val="center"/>
+          </w:tcPr>
+          <w:p>
+            <w:pPr>
+              <w:spacing w:after="0"/>
+            </w:pPr>
+            <w:r/>
+            <w:r>
+              <w:rPr>
+                <w:rFonts w:ascii="Aptos" w:hAnsi="Aptos"/>
+                <w:b w:val="0"/>
+                <w:color w:val="17324D"/>
+                <w:sz w:val="15"/>
+              </w:rPr>
+              <w:t>____</w:t>
+            </w:r>
+          </w:p>
+        </w:tc>
+        <w:tc>
+          <w:tcPr>
+            <w:tcW w:type="dxa" w:w="1440"/>
+            <w:vAlign w:val="center"/>
+          </w:tcPr>
+          <w:p>
+            <w:pPr>
+              <w:spacing w:after="0"/>
+            </w:pPr>
+            <w:r/>
+            <w:r>
+              <w:rPr>
+                <w:rFonts w:ascii="Aptos" w:hAnsi="Aptos"/>
+                <w:b w:val="0"/>
+                <w:color w:val="17324D"/>
+                <w:sz w:val="15"/>
+              </w:rPr>
+            </w:r>
+          </w:p>
+        </w:tc>
+      </w:tr>
+      <w:tr>
+        <w:tc>
+          <w:tcPr>
+            <w:tcW w:type="dxa" w:w="648"/>
+            <w:vAlign w:val="center"/>
+            <w:shd w:fill="F3F5F7"/>
+          </w:tcPr>
+          <w:p>
+            <w:pPr>
+              <w:spacing w:after="0"/>
+            </w:pPr>
+            <w:r/>
+            <w:r>
+              <w:rPr>
+                <w:rFonts w:ascii="Aptos" w:hAnsi="Aptos"/>
+                <w:b w:val="0"/>
+                <w:color w:val="17324D"/>
+                <w:sz w:val="15"/>
+              </w:rPr>
+              <w:t>UAT-18</w:t>
+            </w:r>
+          </w:p>
+        </w:tc>
+        <w:tc>
+          <w:tcPr>
+            <w:tcW w:type="dxa" w:w="1440"/>
+            <w:vAlign w:val="center"/>
+            <w:shd w:fill="F3F5F7"/>
+          </w:tcPr>
+          <w:p>
+            <w:pPr>
+              <w:spacing w:after="0"/>
+            </w:pPr>
+            <w:r/>
+            <w:r>
+              <w:rPr>
+                <w:rFonts w:ascii="Aptos" w:hAnsi="Aptos"/>
+                <w:b w:val="0"/>
+                <w:color w:val="17324D"/>
+                <w:sz w:val="15"/>
+              </w:rPr>
+              <w:t>Doctor</w:t>
+            </w:r>
+          </w:p>
+        </w:tc>
+        <w:tc>
+          <w:tcPr>
+            <w:tcW w:type="dxa" w:w="6264"/>
+            <w:vAlign w:val="center"/>
+            <w:shd w:fill="F3F5F7"/>
+          </w:tcPr>
+          <w:p>
+            <w:pPr>
+              <w:spacing w:after="0"/>
+            </w:pPr>
+            <w:r/>
+            <w:r>
+              <w:rPr>
+                <w:rFonts w:ascii="Aptos" w:hAnsi="Aptos"/>
+                <w:b w:val="0"/>
+                <w:color w:val="17324D"/>
+                <w:sz w:val="15"/>
+              </w:rPr>
+              <w:t>Completed lab result notification appears.</w:t>
+            </w:r>
+          </w:p>
+        </w:tc>
+        <w:tc>
+          <w:tcPr>
+            <w:tcW w:type="dxa" w:w="1080"/>
+            <w:vAlign w:val="center"/>
+            <w:shd w:fill="F3F5F7"/>
+          </w:tcPr>
+          <w:p>
+            <w:pPr>
+              <w:spacing w:after="0"/>
+            </w:pPr>
+            <w:r/>
+            <w:r>
+              <w:rPr>
+                <w:rFonts w:ascii="Aptos" w:hAnsi="Aptos"/>
+                <w:b w:val="0"/>
+                <w:color w:val="17324D"/>
+                <w:sz w:val="15"/>
+              </w:rPr>
+              <w:t>____</w:t>
+            </w:r>
+          </w:p>
+        </w:tc>
+        <w:tc>
+          <w:tcPr>
+            <w:tcW w:type="dxa" w:w="1440"/>
+            <w:vAlign w:val="center"/>
+            <w:shd w:fill="F3F5F7"/>
+          </w:tcPr>
+          <w:p>
+            <w:pPr>
+              <w:spacing w:after="0"/>
+            </w:pPr>
+            <w:r/>
+            <w:r>
+              <w:rPr>
+                <w:rFonts w:ascii="Aptos" w:hAnsi="Aptos"/>
+                <w:b w:val="0"/>
+                <w:color w:val="17324D"/>
+                <w:sz w:val="15"/>
+              </w:rPr>
+            </w:r>
+          </w:p>
+        </w:tc>
+      </w:tr>
+      <w:tr>
+        <w:tc>
+          <w:tcPr>
+            <w:tcW w:type="dxa" w:w="648"/>
+            <w:vAlign w:val="center"/>
+          </w:tcPr>
+          <w:p>
+            <w:pPr>
+              <w:spacing w:after="0"/>
+            </w:pPr>
+            <w:r/>
+            <w:r>
+              <w:rPr>
+                <w:rFonts w:ascii="Aptos" w:hAnsi="Aptos"/>
+                <w:b w:val="0"/>
+                <w:color w:val="17324D"/>
+                <w:sz w:val="15"/>
+              </w:rPr>
+              <w:t>UAT-19</w:t>
+            </w:r>
+          </w:p>
+        </w:tc>
+        <w:tc>
+          <w:tcPr>
+            <w:tcW w:type="dxa" w:w="1440"/>
+            <w:vAlign w:val="center"/>
+          </w:tcPr>
+          <w:p>
+            <w:pPr>
+              <w:spacing w:after="0"/>
+            </w:pPr>
+            <w:r/>
+            <w:r>
+              <w:rPr>
+                <w:rFonts w:ascii="Aptos" w:hAnsi="Aptos"/>
+                <w:b w:val="0"/>
+                <w:color w:val="17324D"/>
+                <w:sz w:val="15"/>
+              </w:rPr>
+              <w:t>Lab Tech</w:t>
+            </w:r>
+          </w:p>
+        </w:tc>
+        <w:tc>
+          <w:tcPr>
+            <w:tcW w:type="dxa" w:w="6264"/>
+            <w:vAlign w:val="center"/>
+          </w:tcPr>
+          <w:p>
+            <w:pPr>
+              <w:spacing w:after="0"/>
+            </w:pPr>
+            <w:r/>
+            <w:r>
+              <w:rPr>
+                <w:rFonts w:ascii="Aptos" w:hAnsi="Aptos"/>
+                <w:b w:val="0"/>
+                <w:color w:val="17324D"/>
+                <w:sz w:val="15"/>
+              </w:rPr>
+              <w:t>Lab Excel downloads and contains result data.</w:t>
+            </w:r>
+          </w:p>
+        </w:tc>
+        <w:tc>
+          <w:tcPr>
+            <w:tcW w:type="dxa" w:w="1080"/>
+            <w:vAlign w:val="center"/>
+          </w:tcPr>
+          <w:p>
+            <w:pPr>
+              <w:spacing w:after="0"/>
+            </w:pPr>
+            <w:r/>
+            <w:r>
+              <w:rPr>
+                <w:rFonts w:ascii="Aptos" w:hAnsi="Aptos"/>
+                <w:b w:val="0"/>
+                <w:color w:val="17324D"/>
+                <w:sz w:val="15"/>
+              </w:rPr>
+              <w:t>____</w:t>
+            </w:r>
+          </w:p>
+        </w:tc>
+        <w:tc>
+          <w:tcPr>
+            <w:tcW w:type="dxa" w:w="1440"/>
+            <w:vAlign w:val="center"/>
+          </w:tcPr>
+          <w:p>
+            <w:pPr>
+              <w:spacing w:after="0"/>
+            </w:pPr>
+            <w:r/>
+            <w:r>
+              <w:rPr>
+                <w:rFonts w:ascii="Aptos" w:hAnsi="Aptos"/>
+                <w:b w:val="0"/>
+                <w:color w:val="17324D"/>
+                <w:sz w:val="15"/>
+              </w:rPr>
+            </w:r>
+          </w:p>
+        </w:tc>
+      </w:tr>
+      <w:tr>
+        <w:tc>
+          <w:tcPr>
+            <w:tcW w:type="dxa" w:w="648"/>
+            <w:vAlign w:val="center"/>
+            <w:shd w:fill="F3F5F7"/>
+          </w:tcPr>
+          <w:p>
+            <w:pPr>
+              <w:spacing w:after="0"/>
+            </w:pPr>
+            <w:r/>
+            <w:r>
+              <w:rPr>
+                <w:rFonts w:ascii="Aptos" w:hAnsi="Aptos"/>
+                <w:b w:val="0"/>
+                <w:color w:val="17324D"/>
+                <w:sz w:val="15"/>
+              </w:rPr>
+              <w:t>UAT-20</w:t>
+            </w:r>
+          </w:p>
+        </w:tc>
+        <w:tc>
+          <w:tcPr>
+            <w:tcW w:type="dxa" w:w="1440"/>
+            <w:vAlign w:val="center"/>
+            <w:shd w:fill="F3F5F7"/>
+          </w:tcPr>
+          <w:p>
+            <w:pPr>
+              <w:spacing w:after="0"/>
+            </w:pPr>
+            <w:r/>
+            <w:r>
+              <w:rPr>
+                <w:rFonts w:ascii="Aptos" w:hAnsi="Aptos"/>
+                <w:b w:val="0"/>
+                <w:color w:val="17324D"/>
+                <w:sz w:val="15"/>
+              </w:rPr>
+              <w:t>Pharmacist</w:t>
+            </w:r>
+          </w:p>
+        </w:tc>
+        <w:tc>
+          <w:tcPr>
+            <w:tcW w:type="dxa" w:w="6264"/>
+            <w:vAlign w:val="center"/>
+            <w:shd w:fill="F3F5F7"/>
+          </w:tcPr>
+          <w:p>
+            <w:pPr>
+              <w:spacing w:after="0"/>
+            </w:pPr>
+            <w:r/>
+            <w:r>
+              <w:rPr>
+                <w:rFonts w:ascii="Aptos" w:hAnsi="Aptos"/>
+                <w:b w:val="0"/>
+                <w:color w:val="17324D"/>
+                <w:sz w:val="15"/>
+              </w:rPr>
+              <w:t>Stock item saves with batch, expiry and price.</w:t>
+            </w:r>
+          </w:p>
+        </w:tc>
+        <w:tc>
+          <w:tcPr>
+            <w:tcW w:type="dxa" w:w="1080"/>
+            <w:vAlign w:val="center"/>
+            <w:shd w:fill="F3F5F7"/>
+          </w:tcPr>
+          <w:p>
+            <w:pPr>
+              <w:spacing w:after="0"/>
+            </w:pPr>
+            <w:r/>
+            <w:r>
+              <w:rPr>
+                <w:rFonts w:ascii="Aptos" w:hAnsi="Aptos"/>
+                <w:b w:val="0"/>
+                <w:color w:val="17324D"/>
+                <w:sz w:val="15"/>
+              </w:rPr>
+              <w:t>____</w:t>
+            </w:r>
+          </w:p>
+        </w:tc>
+        <w:tc>
+          <w:tcPr>
+            <w:tcW w:type="dxa" w:w="1440"/>
+            <w:vAlign w:val="center"/>
+            <w:shd w:fill="F3F5F7"/>
+          </w:tcPr>
+          <w:p>
+            <w:pPr>
+              <w:spacing w:after="0"/>
+            </w:pPr>
+            <w:r/>
+            <w:r>
+              <w:rPr>
+                <w:rFonts w:ascii="Aptos" w:hAnsi="Aptos"/>
+                <w:b w:val="0"/>
+                <w:color w:val="17324D"/>
+                <w:sz w:val="15"/>
+              </w:rPr>
+            </w:r>
+          </w:p>
+        </w:tc>
+      </w:tr>
+    </w:tbl>
+    <w:p>
+      <w:pPr>
+        <w:spacing w:after="0"/>
+      </w:pPr>
+    </w:p>
+    <w:tbl>
+      <w:tblPr>
+        <w:tblStyle w:val="TableGrid"/>
+        <w:tblW w:type="auto" w:w="0"/>
+        <w:jc w:val="center"/>
+        <w:tblLook w:firstColumn="1" w:firstRow="1" w:lastColumn="0" w:lastRow="0" w:noHBand="0" w:noVBand="1" w:val="04A0"/>
+      </w:tblPr>
+      <w:tblGrid>
+        <w:gridCol w:w="2033"/>
+        <w:gridCol w:w="2033"/>
+        <w:gridCol w:w="2033"/>
+        <w:gridCol w:w="2033"/>
+        <w:gridCol w:w="2033"/>
+      </w:tblGrid>
+      <w:tr>
+        <w:tc>
+          <w:tcPr>
+            <w:tcW w:type="dxa" w:w="648"/>
+            <w:vAlign w:val="center"/>
+            <w:shd w:fill="0F766E"/>
+          </w:tcPr>
+          <w:p>
+            <w:pPr>
+              <w:spacing w:after="0"/>
+            </w:pPr>
+            <w:r/>
+            <w:r>
+              <w:rPr>
+                <w:rFonts w:ascii="Aptos" w:hAnsi="Aptos"/>
+                <w:b/>
+                <w:color w:val="FFFFFF"/>
+                <w:sz w:val="15"/>
+              </w:rPr>
+              <w:t>ID</w:t>
+            </w:r>
+          </w:p>
+        </w:tc>
+        <w:tc>
+          <w:tcPr>
+            <w:tcW w:type="dxa" w:w="1440"/>
+            <w:vAlign w:val="center"/>
+            <w:shd w:fill="0F766E"/>
+          </w:tcPr>
+          <w:p>
+            <w:pPr>
+              <w:spacing w:after="0"/>
+            </w:pPr>
+            <w:r/>
+            <w:r>
+              <w:rPr>
+                <w:rFonts w:ascii="Aptos" w:hAnsi="Aptos"/>
+                <w:b/>
+                <w:color w:val="FFFFFF"/>
+                <w:sz w:val="15"/>
+              </w:rPr>
+              <w:t>Role</w:t>
+            </w:r>
+          </w:p>
+        </w:tc>
+        <w:tc>
+          <w:tcPr>
+            <w:tcW w:type="dxa" w:w="6264"/>
+            <w:vAlign w:val="center"/>
+            <w:shd w:fill="0F766E"/>
+          </w:tcPr>
+          <w:p>
+            <w:pPr>
+              <w:spacing w:after="0"/>
+            </w:pPr>
+            <w:r/>
+            <w:r>
+              <w:rPr>
+                <w:rFonts w:ascii="Aptos" w:hAnsi="Aptos"/>
+                <w:b/>
+                <w:color w:val="FFFFFF"/>
+                <w:sz w:val="15"/>
+              </w:rPr>
+              <w:t>Test and expected result</w:t>
+            </w:r>
+          </w:p>
+        </w:tc>
+        <w:tc>
+          <w:tcPr>
+            <w:tcW w:type="dxa" w:w="1080"/>
+            <w:vAlign w:val="center"/>
+            <w:shd w:fill="0F766E"/>
+          </w:tcPr>
+          <w:p>
+            <w:pPr>
+              <w:spacing w:after="0"/>
+            </w:pPr>
+            <w:r/>
+            <w:r>
+              <w:rPr>
+                <w:rFonts w:ascii="Aptos" w:hAnsi="Aptos"/>
+                <w:b/>
+                <w:color w:val="FFFFFF"/>
+                <w:sz w:val="15"/>
+              </w:rPr>
+              <w:t>Result</w:t>
+            </w:r>
+          </w:p>
+        </w:tc>
+        <w:tc>
+          <w:tcPr>
+            <w:tcW w:type="dxa" w:w="1440"/>
+            <w:vAlign w:val="center"/>
+            <w:shd w:fill="0F766E"/>
+          </w:tcPr>
+          <w:p>
+            <w:pPr>
+              <w:spacing w:after="0"/>
+            </w:pPr>
+            <w:r/>
+            <w:r>
+              <w:rPr>
+                <w:rFonts w:ascii="Aptos" w:hAnsi="Aptos"/>
+                <w:b/>
+                <w:color w:val="FFFFFF"/>
+                <w:sz w:val="15"/>
+              </w:rPr>
+              <w:t>Notes</w:t>
+            </w:r>
+          </w:p>
+        </w:tc>
+      </w:tr>
+      <w:tr>
+        <w:tc>
+          <w:tcPr>
+            <w:tcW w:type="dxa" w:w="648"/>
+            <w:vAlign w:val="center"/>
+          </w:tcPr>
+          <w:p>
+            <w:pPr>
+              <w:spacing w:after="0"/>
+            </w:pPr>
+            <w:r/>
+            <w:r>
+              <w:rPr>
+                <w:rFonts w:ascii="Aptos" w:hAnsi="Aptos"/>
+                <w:b w:val="0"/>
+                <w:color w:val="17324D"/>
+                <w:sz w:val="15"/>
+              </w:rPr>
               <w:t>UAT-21</w:t>
             </w:r>
           </w:p>
@@ -5948,7 +9148,7 @@
         <w:keepNext/>
       </w:pPr>
       <w:r>
-        <w:t>12. Training Checklist</w:t>
+        <w:t>13. Training Checklist</w:t>
       </w:r>
     </w:p>
     <w:tbl>
@@ -6114,7 +9314,7 @@
                 <w:color w:val="17324D"/>
                 <w:sz w:val="16"/>
               </w:rPr>
-              <w:t>Role permissions and restricted access</w:t>
+              <w:t>Forgot-password and reset-password recovery</w:t>
             </w:r>
           </w:p>
         </w:tc>
@@ -6180,7 +9380,7 @@
                 <w:color w:val="17324D"/>
                 <w:sz w:val="16"/>
               </w:rPr>
-              <w:t>Patient registration and history</w:t>
+              <w:t>Role permissions and restricted access</w:t>
             </w:r>
           </w:p>
         </w:tc>
@@ -6245,7 +9445,7 @@
                 <w:color w:val="17324D"/>
                 <w:sz w:val="16"/>
               </w:rPr>
-              <w:t>Appointment, reschedule, cancel and queue</w:t>
+              <w:t>Patient registration and history</w:t>
             </w:r>
           </w:p>
         </w:tc>
@@ -6311,7 +9511,7 @@
                 <w:color w:val="17324D"/>
                 <w:sz w:val="16"/>
               </w:rPr>
-              <w:t>EMR review and prescription</w:t>
+              <w:t>Appointment, reschedule, cancel and queue</w:t>
             </w:r>
           </w:p>
         </w:tc>
@@ -6376,7 +9576,7 @@
                 <w:color w:val="17324D"/>
                 <w:sz w:val="16"/>
               </w:rPr>
-              <w:t>Laboratory order and result</w:t>
+              <w:t>EMR review and prescription</w:t>
             </w:r>
           </w:p>
         </w:tc>
@@ -6442,7 +9642,7 @@
                 <w:color w:val="17324D"/>
                 <w:sz w:val="16"/>
               </w:rPr>
-              <w:t>Pharmacy stock and dispensing</w:t>
+              <w:t>Laboratory order and result</w:t>
             </w:r>
           </w:p>
         </w:tc>
@@ -6507,7 +9707,7 @@
                 <w:color w:val="17324D"/>
                 <w:sz w:val="16"/>
               </w:rPr>
-              <w:t>Billing, payment and receipt</w:t>
+              <w:t>Pharmacy stock and dispensing</w:t>
             </w:r>
           </w:p>
         </w:tc>
@@ -6573,7 +9773,7 @@
                 <w:color w:val="17324D"/>
                 <w:sz w:val="16"/>
               </w:rPr>
-              <w:t>Notifications</w:t>
+              <w:t>Billing, payment and receipt</w:t>
             </w:r>
           </w:p>
         </w:tc>
@@ -6638,7 +9838,7 @@
                 <w:color w:val="17324D"/>
                 <w:sz w:val="16"/>
               </w:rPr>
-              <w:t>PDF, Excel and JSON downloads</w:t>
+              <w:t>Hospital branding and invoice configuration</w:t>
             </w:r>
           </w:p>
         </w:tc>
@@ -6704,7 +9904,7 @@
                 <w:color w:val="17324D"/>
                 <w:sz w:val="16"/>
               </w:rPr>
-              <w:t>Audit and backup handling</w:t>
+              <w:t>CSV/XLSX mapping, preview, import and error reports</w:t>
             </w:r>
           </w:p>
         </w:tc>
@@ -6769,6 +9969,203 @@
                 <w:color w:val="17324D"/>
                 <w:sz w:val="16"/>
               </w:rPr>
+              <w:t>Notifications</w:t>
+            </w:r>
+          </w:p>
+        </w:tc>
+        <w:tc>
+          <w:tcPr>
+            <w:tcW w:type="dxa" w:w="1440"/>
+            <w:vAlign w:val="center"/>
+            <w:shd w:fill="F3F5F7"/>
+          </w:tcPr>
+          <w:p>
+            <w:pPr>
+              <w:spacing w:after="0"/>
+            </w:pPr>
+            <w:r/>
+            <w:r>
+              <w:rPr>
+                <w:rFonts w:ascii="Aptos" w:hAnsi="Aptos"/>
+                <w:b w:val="0"/>
+                <w:color w:val="17324D"/>
+                <w:sz w:val="16"/>
+              </w:rPr>
+              <w:t>☐</w:t>
+            </w:r>
+          </w:p>
+        </w:tc>
+        <w:tc>
+          <w:tcPr>
+            <w:tcW w:type="dxa" w:w="2880"/>
+            <w:vAlign w:val="center"/>
+            <w:shd w:fill="F3F5F7"/>
+          </w:tcPr>
+          <w:p>
+            <w:pPr>
+              <w:spacing w:after="0"/>
+            </w:pPr>
+            <w:r/>
+            <w:r>
+              <w:rPr>
+                <w:rFonts w:ascii="Aptos" w:hAnsi="Aptos"/>
+                <w:b w:val="0"/>
+                <w:color w:val="17324D"/>
+                <w:sz w:val="16"/>
+              </w:rPr>
+            </w:r>
+          </w:p>
+        </w:tc>
+      </w:tr>
+      <w:tr>
+        <w:tc>
+          <w:tcPr>
+            <w:tcW w:type="dxa" w:w="5328"/>
+            <w:vAlign w:val="center"/>
+          </w:tcPr>
+          <w:p>
+            <w:pPr>
+              <w:spacing w:after="0"/>
+            </w:pPr>
+            <w:r/>
+            <w:r>
+              <w:rPr>
+                <w:rFonts w:ascii="Aptos" w:hAnsi="Aptos"/>
+                <w:b w:val="0"/>
+                <w:color w:val="17324D"/>
+                <w:sz w:val="16"/>
+              </w:rPr>
+              <w:t>PDF, Excel and JSON downloads</w:t>
+            </w:r>
+          </w:p>
+        </w:tc>
+        <w:tc>
+          <w:tcPr>
+            <w:tcW w:type="dxa" w:w="1440"/>
+            <w:vAlign w:val="center"/>
+          </w:tcPr>
+          <w:p>
+            <w:pPr>
+              <w:spacing w:after="0"/>
+            </w:pPr>
+            <w:r/>
+            <w:r>
+              <w:rPr>
+                <w:rFonts w:ascii="Aptos" w:hAnsi="Aptos"/>
+                <w:b w:val="0"/>
+                <w:color w:val="17324D"/>
+                <w:sz w:val="16"/>
+              </w:rPr>
+              <w:t>☐</w:t>
+            </w:r>
+          </w:p>
+        </w:tc>
+        <w:tc>
+          <w:tcPr>
+            <w:tcW w:type="dxa" w:w="2880"/>
+            <w:vAlign w:val="center"/>
+          </w:tcPr>
+          <w:p>
+            <w:pPr>
+              <w:spacing w:after="0"/>
+            </w:pPr>
+            <w:r/>
+            <w:r>
+              <w:rPr>
+                <w:rFonts w:ascii="Aptos" w:hAnsi="Aptos"/>
+                <w:b w:val="0"/>
+                <w:color w:val="17324D"/>
+                <w:sz w:val="16"/>
+              </w:rPr>
+            </w:r>
+          </w:p>
+        </w:tc>
+      </w:tr>
+      <w:tr>
+        <w:tc>
+          <w:tcPr>
+            <w:tcW w:type="dxa" w:w="5328"/>
+            <w:vAlign w:val="center"/>
+            <w:shd w:fill="F3F5F7"/>
+          </w:tcPr>
+          <w:p>
+            <w:pPr>
+              <w:spacing w:after="0"/>
+            </w:pPr>
+            <w:r/>
+            <w:r>
+              <w:rPr>
+                <w:rFonts w:ascii="Aptos" w:hAnsi="Aptos"/>
+                <w:b w:val="0"/>
+                <w:color w:val="17324D"/>
+                <w:sz w:val="16"/>
+              </w:rPr>
+              <w:t>Audit and backup handling</w:t>
+            </w:r>
+          </w:p>
+        </w:tc>
+        <w:tc>
+          <w:tcPr>
+            <w:tcW w:type="dxa" w:w="1440"/>
+            <w:vAlign w:val="center"/>
+            <w:shd w:fill="F3F5F7"/>
+          </w:tcPr>
+          <w:p>
+            <w:pPr>
+              <w:spacing w:after="0"/>
+            </w:pPr>
+            <w:r/>
+            <w:r>
+              <w:rPr>
+                <w:rFonts w:ascii="Aptos" w:hAnsi="Aptos"/>
+                <w:b w:val="0"/>
+                <w:color w:val="17324D"/>
+                <w:sz w:val="16"/>
+              </w:rPr>
+              <w:t>☐</w:t>
+            </w:r>
+          </w:p>
+        </w:tc>
+        <w:tc>
+          <w:tcPr>
+            <w:tcW w:type="dxa" w:w="2880"/>
+            <w:vAlign w:val="center"/>
+            <w:shd w:fill="F3F5F7"/>
+          </w:tcPr>
+          <w:p>
+            <w:pPr>
+              <w:spacing w:after="0"/>
+            </w:pPr>
+            <w:r/>
+            <w:r>
+              <w:rPr>
+                <w:rFonts w:ascii="Aptos" w:hAnsi="Aptos"/>
+                <w:b w:val="0"/>
+                <w:color w:val="17324D"/>
+                <w:sz w:val="16"/>
+              </w:rPr>
+            </w:r>
+          </w:p>
+        </w:tc>
+      </w:tr>
+      <w:tr>
+        <w:tc>
+          <w:tcPr>
+            <w:tcW w:type="dxa" w:w="5328"/>
+            <w:vAlign w:val="center"/>
+          </w:tcPr>
+          <w:p>
+            <w:pPr>
+              <w:spacing w:after="0"/>
+            </w:pPr>
+            <w:r/>
+            <w:r>
+              <w:rPr>
+                <w:rFonts w:ascii="Aptos" w:hAnsi="Aptos"/>
+                <w:b w:val="0"/>
+                <w:color w:val="17324D"/>
+                <w:sz w:val="16"/>
+              </w:rPr>
               <w:t>Privacy and security responsibilities</w:t>
             </w:r>
           </w:p>
@@ -6777,7 +10174,6 @@
           <w:tcPr>
             <w:tcW w:type="dxa" w:w="1440"/>
             <w:vAlign w:val="center"/>
-            <w:shd w:fill="F3F5F7"/>
           </w:tcPr>
           <w:p>
             <w:pPr>
@@ -6799,7 +10195,6 @@
           <w:tcPr>
             <w:tcW w:type="dxa" w:w="2880"/>
             <w:vAlign w:val="center"/>
-            <w:shd w:fill="F3F5F7"/>
           </w:tcPr>
           <w:p>
             <w:pPr>
@@ -7176,7 +10571,7 @@
         <w:keepNext/>
       </w:pPr>
       <w:r>
-        <w:t>13. Security And Operating Rules</w:t>
+        <w:t>14. Security And Operating Rules</w:t>
       </w:r>
     </w:p>
     <w:p>
@@ -7240,6 +10635,24 @@
       </w:pPr>
       <w:r>
         <w:t>Run client-approved backups on a documented schedule and test recovery separately.</w:t>
+      </w:r>
+    </w:p>
+    <w:p>
+      <w:pPr>
+        <w:pStyle w:val="ListBullet"/>
+        <w:spacing w:after="40"/>
+      </w:pPr>
+      <w:r>
+        <w:t>Never place passwords in staff import files; invitations must use secure activation emails.</w:t>
+      </w:r>
+    </w:p>
+    <w:p>
+      <w:pPr>
+        <w:pStyle w:val="ListBullet"/>
+        <w:spacing w:after="40"/>
+      </w:pPr>
+      <w:r>
+        <w:t>Review invoice drafts before finalization because finalized financial lines are locked.</w:t>
       </w:r>
     </w:p>
     <w:p>

</xml_diff>